<commit_message>
Add Output directory, Prototype 5 assets, update Header.docx, remove fix_lfs scripts
Co-authored-by: Cursor <cursoragent@cursor.com>
</commit_message>
<xml_diff>
--- a/Header.docx
+++ b/Header.docx
@@ -6,13 +6,14 @@
       <w:pPr>
         <w:rPr>
           <w:rFonts w:ascii="Times New Roman" w:hAnsi="Times New Roman" w:cs="Times New Roman"/>
-          <w:sz w:val="24"/>
-          <w:szCs w:val="24"/>
+          <w:szCs w:val="22"/>
         </w:rPr>
       </w:pPr>
       <w:r>
         <w:rPr>
+          <w:rFonts w:ascii="Times New Roman" w:hAnsi="Times New Roman" w:cs="Times New Roman"/>
           <w:noProof/>
+          <w:szCs w:val="22"/>
         </w:rPr>
         <w:drawing>
           <wp:anchor distT="0" distB="0" distL="114300" distR="114300" simplePos="0" relativeHeight="251658240" behindDoc="0" locked="0" layoutInCell="1" allowOverlap="1" wp14:anchorId="7B78C0EC" wp14:editId="57B2A160">
@@ -82,17 +83,1559 @@
       <w:pPr>
         <w:rPr>
           <w:rFonts w:ascii="Times New Roman" w:hAnsi="Times New Roman" w:cs="Times New Roman"/>
-          <w:sz w:val="24"/>
-          <w:szCs w:val="24"/>
+          <w:szCs w:val="22"/>
         </w:rPr>
       </w:pPr>
     </w:p>
     <w:p>
       <w:pPr>
+        <w:jc w:val="center"/>
         <w:rPr>
           <w:rFonts w:ascii="Times New Roman" w:hAnsi="Times New Roman" w:cs="Times New Roman"/>
-          <w:sz w:val="24"/>
-          <w:szCs w:val="24"/>
+          <w:b/>
+          <w:bCs/>
+          <w:sz w:val="32"/>
+          <w:szCs w:val="32"/>
+        </w:rPr>
+      </w:pPr>
+      <w:r>
+        <w:rPr>
+          <w:rFonts w:ascii="Times New Roman" w:hAnsi="Times New Roman" w:cs="Times New Roman"/>
+          <w:b/>
+          <w:bCs/>
+          <w:sz w:val="32"/>
+          <w:szCs w:val="32"/>
+        </w:rPr>
+        <w:t>Survey for Virologists &amp; Researchers — Understanding Challenges and Evaluating VIRO-AI</w:t>
+      </w:r>
+    </w:p>
+    <w:p>
+      <w:pPr>
+        <w:jc w:val="center"/>
+        <w:rPr>
+          <w:rFonts w:ascii="Times New Roman" w:hAnsi="Times New Roman" w:cs="Times New Roman"/>
+          <w:b/>
+          <w:bCs/>
+          <w:sz w:val="32"/>
+          <w:szCs w:val="32"/>
+        </w:rPr>
+      </w:pPr>
+    </w:p>
+    <w:p>
+      <w:pPr>
+        <w:rPr>
+          <w:rFonts w:ascii="Times New Roman" w:hAnsi="Times New Roman" w:cs="Times New Roman"/>
+          <w:b/>
+          <w:bCs/>
+          <w:szCs w:val="22"/>
+        </w:rPr>
+      </w:pPr>
+      <w:r>
+        <w:rPr>
+          <w:rFonts w:ascii="Times New Roman" w:hAnsi="Times New Roman" w:cs="Times New Roman"/>
+          <w:b/>
+          <w:bCs/>
+          <w:szCs w:val="22"/>
+        </w:rPr>
+        <w:t>SECTION 1 — Current Challenges in Viral Genomics &amp; Mutation Tracking</w:t>
+      </w:r>
+    </w:p>
+    <w:p>
+      <w:pPr>
+        <w:numPr>
+          <w:ilvl w:val="0"/>
+          <w:numId w:val="118"/>
+        </w:numPr>
+        <w:rPr>
+          <w:rFonts w:ascii="Times New Roman" w:hAnsi="Times New Roman" w:cs="Times New Roman"/>
+          <w:szCs w:val="22"/>
+        </w:rPr>
+      </w:pPr>
+      <w:r>
+        <w:rPr>
+          <w:rFonts w:ascii="Times New Roman" w:hAnsi="Times New Roman" w:cs="Times New Roman"/>
+          <w:b/>
+          <w:bCs/>
+          <w:szCs w:val="22"/>
+        </w:rPr>
+        <w:t>How frequently do you encounter difficulties in predicting emerging viral mutations using current tools?</w:t>
+      </w:r>
+      <w:r>
+        <w:rPr>
+          <w:rFonts w:ascii="Times New Roman" w:hAnsi="Times New Roman" w:cs="Times New Roman"/>
+          <w:szCs w:val="22"/>
+        </w:rPr>
+        <w:br/>
+        <w:t>(Given the rapid, unpredictable evolution of viruses like SARS-CoV-2, HIV, Influenza, and zoonotic viruses)</w:t>
+      </w:r>
+    </w:p>
+    <w:p>
+      <w:pPr>
+        <w:numPr>
+          <w:ilvl w:val="0"/>
+          <w:numId w:val="118"/>
+        </w:numPr>
+        <w:rPr>
+          <w:rFonts w:ascii="Times New Roman" w:hAnsi="Times New Roman" w:cs="Times New Roman"/>
+          <w:szCs w:val="22"/>
+        </w:rPr>
+      </w:pPr>
+      <w:r>
+        <w:rPr>
+          <w:rFonts w:ascii="Times New Roman" w:hAnsi="Times New Roman" w:cs="Times New Roman"/>
+          <w:b/>
+          <w:bCs/>
+          <w:szCs w:val="22"/>
+        </w:rPr>
+        <w:t>Which of the following mutation-related problems most affect your research?</w:t>
+      </w:r>
+    </w:p>
+    <w:p>
+      <w:pPr>
+        <w:numPr>
+          <w:ilvl w:val="1"/>
+          <w:numId w:val="118"/>
+        </w:numPr>
+        <w:rPr>
+          <w:rFonts w:ascii="Times New Roman" w:hAnsi="Times New Roman" w:cs="Times New Roman"/>
+          <w:szCs w:val="22"/>
+        </w:rPr>
+      </w:pPr>
+      <w:r>
+        <w:rPr>
+          <w:rFonts w:ascii="Times New Roman" w:hAnsi="Times New Roman" w:cs="Times New Roman"/>
+          <w:szCs w:val="22"/>
+        </w:rPr>
+        <w:t>Inability to forecast immune-escape mutations</w:t>
+      </w:r>
+    </w:p>
+    <w:p>
+      <w:pPr>
+        <w:numPr>
+          <w:ilvl w:val="1"/>
+          <w:numId w:val="118"/>
+        </w:numPr>
+        <w:rPr>
+          <w:rFonts w:ascii="Times New Roman" w:hAnsi="Times New Roman" w:cs="Times New Roman"/>
+          <w:szCs w:val="22"/>
+        </w:rPr>
+      </w:pPr>
+      <w:r>
+        <w:rPr>
+          <w:rFonts w:ascii="Times New Roman" w:hAnsi="Times New Roman" w:cs="Times New Roman"/>
+          <w:szCs w:val="22"/>
+        </w:rPr>
+        <w:t xml:space="preserve">Slow pipeline for </w:t>
+      </w:r>
+      <w:proofErr w:type="spellStart"/>
+      <w:r>
+        <w:rPr>
+          <w:rFonts w:ascii="Times New Roman" w:hAnsi="Times New Roman" w:cs="Times New Roman"/>
+          <w:szCs w:val="22"/>
+        </w:rPr>
+        <w:t>analyzing</w:t>
+      </w:r>
+      <w:proofErr w:type="spellEnd"/>
+      <w:r>
+        <w:rPr>
+          <w:rFonts w:ascii="Times New Roman" w:hAnsi="Times New Roman" w:cs="Times New Roman"/>
+          <w:szCs w:val="22"/>
+        </w:rPr>
+        <w:t xml:space="preserve"> real-world genomic data</w:t>
+      </w:r>
+    </w:p>
+    <w:p>
+      <w:pPr>
+        <w:numPr>
+          <w:ilvl w:val="1"/>
+          <w:numId w:val="118"/>
+        </w:numPr>
+        <w:rPr>
+          <w:rFonts w:ascii="Times New Roman" w:hAnsi="Times New Roman" w:cs="Times New Roman"/>
+          <w:szCs w:val="22"/>
+        </w:rPr>
+      </w:pPr>
+      <w:r>
+        <w:rPr>
+          <w:rFonts w:ascii="Times New Roman" w:hAnsi="Times New Roman" w:cs="Times New Roman"/>
+          <w:szCs w:val="22"/>
+        </w:rPr>
+        <w:t>Lack of integrated tools linking mutation → structural impact → clinical impact</w:t>
+      </w:r>
+    </w:p>
+    <w:p>
+      <w:pPr>
+        <w:numPr>
+          <w:ilvl w:val="1"/>
+          <w:numId w:val="118"/>
+        </w:numPr>
+        <w:rPr>
+          <w:rFonts w:ascii="Times New Roman" w:hAnsi="Times New Roman" w:cs="Times New Roman"/>
+          <w:szCs w:val="22"/>
+        </w:rPr>
+      </w:pPr>
+      <w:r>
+        <w:rPr>
+          <w:rFonts w:ascii="Times New Roman" w:hAnsi="Times New Roman" w:cs="Times New Roman"/>
+          <w:szCs w:val="22"/>
+        </w:rPr>
+        <w:t>Limited access to high-throughput computational resources</w:t>
+      </w:r>
+    </w:p>
+    <w:p>
+      <w:pPr>
+        <w:numPr>
+          <w:ilvl w:val="0"/>
+          <w:numId w:val="118"/>
+        </w:numPr>
+        <w:rPr>
+          <w:rFonts w:ascii="Times New Roman" w:hAnsi="Times New Roman" w:cs="Times New Roman"/>
+          <w:szCs w:val="22"/>
+        </w:rPr>
+      </w:pPr>
+      <w:r>
+        <w:rPr>
+          <w:rFonts w:ascii="Times New Roman" w:hAnsi="Times New Roman" w:cs="Times New Roman"/>
+          <w:b/>
+          <w:bCs/>
+          <w:szCs w:val="22"/>
+        </w:rPr>
+        <w:t>How much does the absence of real-time, AI-based mutation forecasting impede your ability to design experiments or therapeutic strategies?</w:t>
+      </w:r>
+    </w:p>
+    <w:p>
+      <w:pPr>
+        <w:numPr>
+          <w:ilvl w:val="0"/>
+          <w:numId w:val="118"/>
+        </w:numPr>
+        <w:rPr>
+          <w:rFonts w:ascii="Times New Roman" w:hAnsi="Times New Roman" w:cs="Times New Roman"/>
+          <w:szCs w:val="22"/>
+        </w:rPr>
+      </w:pPr>
+      <w:r>
+        <w:rPr>
+          <w:rFonts w:ascii="Times New Roman" w:hAnsi="Times New Roman" w:cs="Times New Roman"/>
+          <w:b/>
+          <w:bCs/>
+          <w:szCs w:val="22"/>
+        </w:rPr>
+        <w:t>Do you currently use MCMC, HMMs, codon substitution matrices (PAM/BLOSUM), or other evolutionary models?</w:t>
+      </w:r>
+    </w:p>
+    <w:p>
+      <w:pPr>
+        <w:numPr>
+          <w:ilvl w:val="1"/>
+          <w:numId w:val="118"/>
+        </w:numPr>
+        <w:rPr>
+          <w:rFonts w:ascii="Times New Roman" w:hAnsi="Times New Roman" w:cs="Times New Roman"/>
+          <w:szCs w:val="22"/>
+        </w:rPr>
+      </w:pPr>
+      <w:r>
+        <w:rPr>
+          <w:rFonts w:ascii="Times New Roman" w:hAnsi="Times New Roman" w:cs="Times New Roman"/>
+          <w:szCs w:val="22"/>
+        </w:rPr>
+        <w:t>If yes, what limitations do you face in making predictions biologically reliable over time?</w:t>
+      </w:r>
+      <w:r>
+        <w:rPr>
+          <w:rFonts w:ascii="Times New Roman" w:hAnsi="Times New Roman" w:cs="Times New Roman"/>
+          <w:szCs w:val="22"/>
+        </w:rPr>
+        <w:br/>
+        <w:t>(VIRO-AI currently integrates these models)</w:t>
+      </w:r>
+    </w:p>
+    <w:p>
+      <w:pPr>
+        <w:rPr>
+          <w:rFonts w:ascii="Times New Roman" w:hAnsi="Times New Roman" w:cs="Times New Roman"/>
+          <w:szCs w:val="22"/>
+        </w:rPr>
+      </w:pPr>
+    </w:p>
+    <w:p>
+      <w:pPr>
+        <w:rPr>
+          <w:rFonts w:ascii="Times New Roman" w:hAnsi="Times New Roman" w:cs="Times New Roman"/>
+          <w:b/>
+          <w:bCs/>
+          <w:szCs w:val="22"/>
+        </w:rPr>
+      </w:pPr>
+      <w:r>
+        <w:rPr>
+          <w:rFonts w:ascii="Times New Roman" w:hAnsi="Times New Roman" w:cs="Times New Roman"/>
+          <w:b/>
+          <w:bCs/>
+          <w:szCs w:val="22"/>
+        </w:rPr>
+        <w:t>SECTION 2 — Structural Biology, Protein Folding &amp; MD Simulation Challenges</w:t>
+      </w:r>
+    </w:p>
+    <w:p>
+      <w:pPr>
+        <w:numPr>
+          <w:ilvl w:val="0"/>
+          <w:numId w:val="119"/>
+        </w:numPr>
+        <w:rPr>
+          <w:rFonts w:ascii="Times New Roman" w:hAnsi="Times New Roman" w:cs="Times New Roman"/>
+          <w:szCs w:val="22"/>
+        </w:rPr>
+      </w:pPr>
+      <w:r>
+        <w:rPr>
+          <w:rFonts w:ascii="Times New Roman" w:hAnsi="Times New Roman" w:cs="Times New Roman"/>
+          <w:b/>
+          <w:bCs/>
+          <w:szCs w:val="22"/>
+        </w:rPr>
+        <w:t>How accessible are high-performance simulations (AlphaFold/</w:t>
+      </w:r>
+      <w:proofErr w:type="spellStart"/>
+      <w:r>
+        <w:rPr>
+          <w:rFonts w:ascii="Times New Roman" w:hAnsi="Times New Roman" w:cs="Times New Roman"/>
+          <w:b/>
+          <w:bCs/>
+          <w:szCs w:val="22"/>
+        </w:rPr>
+        <w:t>OpenFold</w:t>
+      </w:r>
+      <w:proofErr w:type="spellEnd"/>
+      <w:r>
+        <w:rPr>
+          <w:rFonts w:ascii="Times New Roman" w:hAnsi="Times New Roman" w:cs="Times New Roman"/>
+          <w:b/>
+          <w:bCs/>
+          <w:szCs w:val="22"/>
+        </w:rPr>
+        <w:t>, MD with AMBER/CHARMM/GROMOS) in your institution?</w:t>
+      </w:r>
+      <w:r>
+        <w:rPr>
+          <w:rFonts w:ascii="Times New Roman" w:hAnsi="Times New Roman" w:cs="Times New Roman"/>
+          <w:szCs w:val="22"/>
+        </w:rPr>
+        <w:br/>
+        <w:t>(VIRO-AI leverages these methods)</w:t>
+      </w:r>
+    </w:p>
+    <w:p>
+      <w:pPr>
+        <w:numPr>
+          <w:ilvl w:val="0"/>
+          <w:numId w:val="119"/>
+        </w:numPr>
+        <w:rPr>
+          <w:rFonts w:ascii="Times New Roman" w:hAnsi="Times New Roman" w:cs="Times New Roman"/>
+          <w:szCs w:val="22"/>
+        </w:rPr>
+      </w:pPr>
+      <w:r>
+        <w:rPr>
+          <w:rFonts w:ascii="Times New Roman" w:hAnsi="Times New Roman" w:cs="Times New Roman"/>
+          <w:b/>
+          <w:bCs/>
+          <w:szCs w:val="22"/>
+        </w:rPr>
+        <w:t>What challenges do you face while validating structural effects of mutations?</w:t>
+      </w:r>
+    </w:p>
+    <w:p>
+      <w:pPr>
+        <w:numPr>
+          <w:ilvl w:val="1"/>
+          <w:numId w:val="119"/>
+        </w:numPr>
+        <w:rPr>
+          <w:rFonts w:ascii="Times New Roman" w:hAnsi="Times New Roman" w:cs="Times New Roman"/>
+          <w:szCs w:val="22"/>
+        </w:rPr>
+      </w:pPr>
+      <w:r>
+        <w:rPr>
+          <w:rFonts w:ascii="Times New Roman" w:hAnsi="Times New Roman" w:cs="Times New Roman"/>
+          <w:szCs w:val="22"/>
+        </w:rPr>
+        <w:t>RMSD/RMSF instability</w:t>
+      </w:r>
+    </w:p>
+    <w:p>
+      <w:pPr>
+        <w:numPr>
+          <w:ilvl w:val="1"/>
+          <w:numId w:val="119"/>
+        </w:numPr>
+        <w:rPr>
+          <w:rFonts w:ascii="Times New Roman" w:hAnsi="Times New Roman" w:cs="Times New Roman"/>
+          <w:szCs w:val="22"/>
+        </w:rPr>
+      </w:pPr>
+      <w:r>
+        <w:rPr>
+          <w:rFonts w:ascii="Times New Roman" w:hAnsi="Times New Roman" w:cs="Times New Roman"/>
+          <w:szCs w:val="22"/>
+        </w:rPr>
+        <w:t>ΔG estimation inaccuracies</w:t>
+      </w:r>
+    </w:p>
+    <w:p>
+      <w:pPr>
+        <w:numPr>
+          <w:ilvl w:val="1"/>
+          <w:numId w:val="119"/>
+        </w:numPr>
+        <w:rPr>
+          <w:rFonts w:ascii="Times New Roman" w:hAnsi="Times New Roman" w:cs="Times New Roman"/>
+          <w:szCs w:val="22"/>
+        </w:rPr>
+      </w:pPr>
+      <w:r>
+        <w:rPr>
+          <w:rFonts w:ascii="Times New Roman" w:hAnsi="Times New Roman" w:cs="Times New Roman"/>
+          <w:szCs w:val="22"/>
+        </w:rPr>
+        <w:t>Long simulation times</w:t>
+      </w:r>
+    </w:p>
+    <w:p>
+      <w:pPr>
+        <w:numPr>
+          <w:ilvl w:val="1"/>
+          <w:numId w:val="119"/>
+        </w:numPr>
+        <w:rPr>
+          <w:rFonts w:ascii="Times New Roman" w:hAnsi="Times New Roman" w:cs="Times New Roman"/>
+          <w:szCs w:val="22"/>
+        </w:rPr>
+      </w:pPr>
+      <w:r>
+        <w:rPr>
+          <w:rFonts w:ascii="Times New Roman" w:hAnsi="Times New Roman" w:cs="Times New Roman"/>
+          <w:szCs w:val="22"/>
+        </w:rPr>
+        <w:t>No integration between protein structure and mutation forecasting</w:t>
+      </w:r>
+    </w:p>
+    <w:p>
+      <w:pPr>
+        <w:numPr>
+          <w:ilvl w:val="0"/>
+          <w:numId w:val="119"/>
+        </w:numPr>
+        <w:rPr>
+          <w:rFonts w:ascii="Times New Roman" w:hAnsi="Times New Roman" w:cs="Times New Roman"/>
+          <w:szCs w:val="22"/>
+        </w:rPr>
+      </w:pPr>
+      <w:r>
+        <w:rPr>
+          <w:rFonts w:ascii="Times New Roman" w:hAnsi="Times New Roman" w:cs="Times New Roman"/>
+          <w:b/>
+          <w:bCs/>
+          <w:szCs w:val="22"/>
+        </w:rPr>
+        <w:t>Do you struggle to correlate predicted mutations with conformational changes and binding pocket variations?</w:t>
+      </w:r>
+    </w:p>
+    <w:p>
+      <w:pPr>
+        <w:numPr>
+          <w:ilvl w:val="0"/>
+          <w:numId w:val="119"/>
+        </w:numPr>
+        <w:rPr>
+          <w:rFonts w:ascii="Times New Roman" w:hAnsi="Times New Roman" w:cs="Times New Roman"/>
+          <w:szCs w:val="22"/>
+        </w:rPr>
+      </w:pPr>
+      <w:r>
+        <w:rPr>
+          <w:rFonts w:ascii="Times New Roman" w:hAnsi="Times New Roman" w:cs="Times New Roman"/>
+          <w:b/>
+          <w:bCs/>
+          <w:szCs w:val="22"/>
+        </w:rPr>
+        <w:t>How often do you rely on GPU-accelerated MD simulations, and what is your biggest bottleneck in using them?</w:t>
+      </w:r>
+    </w:p>
+    <w:p>
+      <w:pPr>
+        <w:rPr>
+          <w:rFonts w:ascii="Times New Roman" w:hAnsi="Times New Roman" w:cs="Times New Roman"/>
+          <w:b/>
+          <w:bCs/>
+          <w:szCs w:val="22"/>
+        </w:rPr>
+      </w:pPr>
+      <w:r>
+        <w:rPr>
+          <w:rFonts w:ascii="Times New Roman" w:hAnsi="Times New Roman" w:cs="Times New Roman"/>
+          <w:b/>
+          <w:bCs/>
+          <w:szCs w:val="22"/>
+        </w:rPr>
+        <w:lastRenderedPageBreak/>
+        <w:t>SECTION 3 — Drug Discovery, Docking &amp; Antiviral Development Challenges</w:t>
+      </w:r>
+    </w:p>
+    <w:p>
+      <w:pPr>
+        <w:numPr>
+          <w:ilvl w:val="0"/>
+          <w:numId w:val="120"/>
+        </w:numPr>
+        <w:rPr>
+          <w:rFonts w:ascii="Times New Roman" w:hAnsi="Times New Roman" w:cs="Times New Roman"/>
+          <w:szCs w:val="22"/>
+        </w:rPr>
+      </w:pPr>
+      <w:r>
+        <w:rPr>
+          <w:rFonts w:ascii="Times New Roman" w:hAnsi="Times New Roman" w:cs="Times New Roman"/>
+          <w:b/>
+          <w:bCs/>
+          <w:szCs w:val="22"/>
+        </w:rPr>
+        <w:t>What are your primary limitations in antiviral drug design?</w:t>
+      </w:r>
+    </w:p>
+    <w:p>
+      <w:pPr>
+        <w:numPr>
+          <w:ilvl w:val="1"/>
+          <w:numId w:val="120"/>
+        </w:numPr>
+        <w:rPr>
+          <w:rFonts w:ascii="Times New Roman" w:hAnsi="Times New Roman" w:cs="Times New Roman"/>
+          <w:szCs w:val="22"/>
+        </w:rPr>
+      </w:pPr>
+      <w:r>
+        <w:rPr>
+          <w:rFonts w:ascii="Times New Roman" w:hAnsi="Times New Roman" w:cs="Times New Roman"/>
+          <w:szCs w:val="22"/>
+        </w:rPr>
+        <w:t>Slow docking and rescoring cycles</w:t>
+      </w:r>
+    </w:p>
+    <w:p>
+      <w:pPr>
+        <w:numPr>
+          <w:ilvl w:val="1"/>
+          <w:numId w:val="120"/>
+        </w:numPr>
+        <w:rPr>
+          <w:rFonts w:ascii="Times New Roman" w:hAnsi="Times New Roman" w:cs="Times New Roman"/>
+          <w:szCs w:val="22"/>
+        </w:rPr>
+      </w:pPr>
+      <w:r>
+        <w:rPr>
+          <w:rFonts w:ascii="Times New Roman" w:hAnsi="Times New Roman" w:cs="Times New Roman"/>
+          <w:szCs w:val="22"/>
+        </w:rPr>
+        <w:t>Difficulty generating novel ligands</w:t>
+      </w:r>
+    </w:p>
+    <w:p>
+      <w:pPr>
+        <w:numPr>
+          <w:ilvl w:val="1"/>
+          <w:numId w:val="120"/>
+        </w:numPr>
+        <w:rPr>
+          <w:rFonts w:ascii="Times New Roman" w:hAnsi="Times New Roman" w:cs="Times New Roman"/>
+          <w:szCs w:val="22"/>
+        </w:rPr>
+      </w:pPr>
+      <w:r>
+        <w:rPr>
+          <w:rFonts w:ascii="Times New Roman" w:hAnsi="Times New Roman" w:cs="Times New Roman"/>
+          <w:szCs w:val="22"/>
+        </w:rPr>
+        <w:t>Limited ADMET prediction accuracy</w:t>
+      </w:r>
+    </w:p>
+    <w:p>
+      <w:pPr>
+        <w:numPr>
+          <w:ilvl w:val="1"/>
+          <w:numId w:val="120"/>
+        </w:numPr>
+        <w:rPr>
+          <w:rFonts w:ascii="Times New Roman" w:hAnsi="Times New Roman" w:cs="Times New Roman"/>
+          <w:szCs w:val="22"/>
+        </w:rPr>
+      </w:pPr>
+      <w:r>
+        <w:rPr>
+          <w:rFonts w:ascii="Times New Roman" w:hAnsi="Times New Roman" w:cs="Times New Roman"/>
+          <w:szCs w:val="22"/>
+        </w:rPr>
+        <w:t>Lack of QM/MM refinement for lead molecules</w:t>
+      </w:r>
+      <w:r>
+        <w:rPr>
+          <w:rFonts w:ascii="Times New Roman" w:hAnsi="Times New Roman" w:cs="Times New Roman"/>
+          <w:szCs w:val="22"/>
+        </w:rPr>
+        <w:br/>
+        <w:t>(VIRO-AI integrates VAE/GAN generative chemistry + docking + QM/MM)</w:t>
+      </w:r>
+    </w:p>
+    <w:p>
+      <w:pPr>
+        <w:numPr>
+          <w:ilvl w:val="0"/>
+          <w:numId w:val="120"/>
+        </w:numPr>
+        <w:rPr>
+          <w:rFonts w:ascii="Times New Roman" w:hAnsi="Times New Roman" w:cs="Times New Roman"/>
+          <w:szCs w:val="22"/>
+        </w:rPr>
+      </w:pPr>
+      <w:r>
+        <w:rPr>
+          <w:rFonts w:ascii="Times New Roman" w:hAnsi="Times New Roman" w:cs="Times New Roman"/>
+          <w:b/>
+          <w:bCs/>
+          <w:szCs w:val="22"/>
+        </w:rPr>
+        <w:t>Do you currently use virtual screening or generative AI for drug discovery? If yes, where do they fall short?</w:t>
+      </w:r>
+    </w:p>
+    <w:p>
+      <w:pPr>
+        <w:numPr>
+          <w:ilvl w:val="0"/>
+          <w:numId w:val="120"/>
+        </w:numPr>
+        <w:rPr>
+          <w:rFonts w:ascii="Times New Roman" w:hAnsi="Times New Roman" w:cs="Times New Roman"/>
+          <w:szCs w:val="22"/>
+        </w:rPr>
+      </w:pPr>
+      <w:r>
+        <w:rPr>
+          <w:rFonts w:ascii="Times New Roman" w:hAnsi="Times New Roman" w:cs="Times New Roman"/>
+          <w:b/>
+          <w:bCs/>
+          <w:szCs w:val="22"/>
+        </w:rPr>
+        <w:t>How often do you need to predict chemical modifications (methylation, halogenation, hydroxylation) to improve leads?</w:t>
+      </w:r>
+      <w:r>
+        <w:rPr>
+          <w:rFonts w:ascii="Times New Roman" w:hAnsi="Times New Roman" w:cs="Times New Roman"/>
+          <w:szCs w:val="22"/>
+        </w:rPr>
+        <w:br/>
+        <w:t>(VIRO-AI supports adaptive drug modification workflows)</w:t>
+      </w:r>
+    </w:p>
+    <w:p>
+      <w:pPr>
+        <w:ind w:left="720"/>
+        <w:rPr>
+          <w:rFonts w:ascii="Times New Roman" w:hAnsi="Times New Roman" w:cs="Times New Roman"/>
+          <w:szCs w:val="22"/>
+        </w:rPr>
+      </w:pPr>
+    </w:p>
+    <w:p>
+      <w:pPr>
+        <w:rPr>
+          <w:rFonts w:ascii="Times New Roman" w:hAnsi="Times New Roman" w:cs="Times New Roman"/>
+          <w:b/>
+          <w:bCs/>
+          <w:szCs w:val="22"/>
+        </w:rPr>
+      </w:pPr>
+      <w:r>
+        <w:rPr>
+          <w:rFonts w:ascii="Times New Roman" w:hAnsi="Times New Roman" w:cs="Times New Roman"/>
+          <w:b/>
+          <w:bCs/>
+          <w:szCs w:val="22"/>
+        </w:rPr>
+        <w:t>SECTION 4 — Clinical Trial Simulation, Toxicity Prediction &amp; Ethical Challenges</w:t>
+      </w:r>
+    </w:p>
+    <w:p>
+      <w:pPr>
+        <w:numPr>
+          <w:ilvl w:val="0"/>
+          <w:numId w:val="121"/>
+        </w:numPr>
+        <w:rPr>
+          <w:rFonts w:ascii="Times New Roman" w:hAnsi="Times New Roman" w:cs="Times New Roman"/>
+          <w:szCs w:val="22"/>
+        </w:rPr>
+      </w:pPr>
+      <w:r>
+        <w:rPr>
+          <w:rFonts w:ascii="Times New Roman" w:hAnsi="Times New Roman" w:cs="Times New Roman"/>
+          <w:b/>
+          <w:bCs/>
+          <w:szCs w:val="22"/>
+        </w:rPr>
+        <w:t>Do you think early-phase human trials could be significantly reduced or replaced by AI-driven in-silico PBPK/PKPD simulations?</w:t>
+      </w:r>
+      <w:r>
+        <w:rPr>
+          <w:rFonts w:ascii="Times New Roman" w:hAnsi="Times New Roman" w:cs="Times New Roman"/>
+          <w:szCs w:val="22"/>
+        </w:rPr>
+        <w:br/>
+        <w:t>(VIRO-AI’s digital twin simulation addresses this)</w:t>
+      </w:r>
+    </w:p>
+    <w:p>
+      <w:pPr>
+        <w:numPr>
+          <w:ilvl w:val="0"/>
+          <w:numId w:val="121"/>
+        </w:numPr>
+        <w:rPr>
+          <w:rFonts w:ascii="Times New Roman" w:hAnsi="Times New Roman" w:cs="Times New Roman"/>
+          <w:szCs w:val="22"/>
+        </w:rPr>
+      </w:pPr>
+      <w:r>
+        <w:rPr>
+          <w:rFonts w:ascii="Times New Roman" w:hAnsi="Times New Roman" w:cs="Times New Roman"/>
+          <w:b/>
+          <w:bCs/>
+          <w:szCs w:val="22"/>
+        </w:rPr>
+        <w:t>Which toxicity/immunogenicity predictions are most difficult to model in early research?</w:t>
+      </w:r>
+    </w:p>
+    <w:p>
+      <w:pPr>
+        <w:numPr>
+          <w:ilvl w:val="1"/>
+          <w:numId w:val="121"/>
+        </w:numPr>
+        <w:rPr>
+          <w:rFonts w:ascii="Times New Roman" w:hAnsi="Times New Roman" w:cs="Times New Roman"/>
+          <w:szCs w:val="22"/>
+        </w:rPr>
+      </w:pPr>
+      <w:r>
+        <w:rPr>
+          <w:rFonts w:ascii="Times New Roman" w:hAnsi="Times New Roman" w:cs="Times New Roman"/>
+          <w:szCs w:val="22"/>
+        </w:rPr>
+        <w:t>Cytokine storms</w:t>
+      </w:r>
+    </w:p>
+    <w:p>
+      <w:pPr>
+        <w:numPr>
+          <w:ilvl w:val="1"/>
+          <w:numId w:val="121"/>
+        </w:numPr>
+        <w:rPr>
+          <w:rFonts w:ascii="Times New Roman" w:hAnsi="Times New Roman" w:cs="Times New Roman"/>
+          <w:szCs w:val="22"/>
+        </w:rPr>
+      </w:pPr>
+      <w:r>
+        <w:rPr>
+          <w:rFonts w:ascii="Times New Roman" w:hAnsi="Times New Roman" w:cs="Times New Roman"/>
+          <w:szCs w:val="22"/>
+        </w:rPr>
+        <w:t>Off-target binding</w:t>
+      </w:r>
+    </w:p>
+    <w:p>
+      <w:pPr>
+        <w:numPr>
+          <w:ilvl w:val="1"/>
+          <w:numId w:val="121"/>
+        </w:numPr>
+        <w:rPr>
+          <w:rFonts w:ascii="Times New Roman" w:hAnsi="Times New Roman" w:cs="Times New Roman"/>
+          <w:szCs w:val="22"/>
+        </w:rPr>
+      </w:pPr>
+      <w:r>
+        <w:rPr>
+          <w:rFonts w:ascii="Times New Roman" w:hAnsi="Times New Roman" w:cs="Times New Roman"/>
+          <w:szCs w:val="22"/>
+        </w:rPr>
+        <w:t>Hepatotoxicity</w:t>
+      </w:r>
+    </w:p>
+    <w:p>
+      <w:pPr>
+        <w:numPr>
+          <w:ilvl w:val="1"/>
+          <w:numId w:val="121"/>
+        </w:numPr>
+        <w:rPr>
+          <w:rFonts w:ascii="Times New Roman" w:hAnsi="Times New Roman" w:cs="Times New Roman"/>
+          <w:szCs w:val="22"/>
+        </w:rPr>
+      </w:pPr>
+      <w:r>
+        <w:rPr>
+          <w:rFonts w:ascii="Times New Roman" w:hAnsi="Times New Roman" w:cs="Times New Roman"/>
+          <w:szCs w:val="22"/>
+        </w:rPr>
+        <w:t>Allergenicity responses</w:t>
+      </w:r>
+    </w:p>
+    <w:p>
+      <w:pPr>
+        <w:numPr>
+          <w:ilvl w:val="0"/>
+          <w:numId w:val="121"/>
+        </w:numPr>
+        <w:rPr>
+          <w:rFonts w:ascii="Times New Roman" w:hAnsi="Times New Roman" w:cs="Times New Roman"/>
+          <w:szCs w:val="22"/>
+        </w:rPr>
+      </w:pPr>
+      <w:r>
+        <w:rPr>
+          <w:rFonts w:ascii="Times New Roman" w:hAnsi="Times New Roman" w:cs="Times New Roman"/>
+          <w:b/>
+          <w:bCs/>
+          <w:szCs w:val="22"/>
+        </w:rPr>
+        <w:t xml:space="preserve">Do you believe predictive computational </w:t>
+      </w:r>
+      <w:proofErr w:type="spellStart"/>
+      <w:r>
+        <w:rPr>
+          <w:rFonts w:ascii="Times New Roman" w:hAnsi="Times New Roman" w:cs="Times New Roman"/>
+          <w:b/>
+          <w:bCs/>
+          <w:szCs w:val="22"/>
+        </w:rPr>
+        <w:t>modeling</w:t>
+      </w:r>
+      <w:proofErr w:type="spellEnd"/>
+      <w:r>
+        <w:rPr>
+          <w:rFonts w:ascii="Times New Roman" w:hAnsi="Times New Roman" w:cs="Times New Roman"/>
+          <w:b/>
+          <w:bCs/>
+          <w:szCs w:val="22"/>
+        </w:rPr>
+        <w:t xml:space="preserve"> could ethically reduce trial-related risk? If yes, what capabilities would you require?</w:t>
+      </w:r>
+    </w:p>
+    <w:p>
+      <w:pPr>
+        <w:rPr>
+          <w:rFonts w:ascii="Times New Roman" w:hAnsi="Times New Roman" w:cs="Times New Roman"/>
+          <w:szCs w:val="22"/>
+        </w:rPr>
+      </w:pPr>
+    </w:p>
+    <w:p>
+      <w:pPr>
+        <w:rPr>
+          <w:rFonts w:ascii="Times New Roman" w:hAnsi="Times New Roman" w:cs="Times New Roman"/>
+          <w:b/>
+          <w:bCs/>
+          <w:szCs w:val="22"/>
+        </w:rPr>
+      </w:pPr>
+      <w:r>
+        <w:rPr>
+          <w:rFonts w:ascii="Times New Roman" w:hAnsi="Times New Roman" w:cs="Times New Roman"/>
+          <w:b/>
+          <w:bCs/>
+          <w:szCs w:val="22"/>
+        </w:rPr>
+        <w:t xml:space="preserve">SECTION 5 — Epidemiological </w:t>
+      </w:r>
+      <w:proofErr w:type="spellStart"/>
+      <w:r>
+        <w:rPr>
+          <w:rFonts w:ascii="Times New Roman" w:hAnsi="Times New Roman" w:cs="Times New Roman"/>
+          <w:b/>
+          <w:bCs/>
+          <w:szCs w:val="22"/>
+        </w:rPr>
+        <w:t>Modeling</w:t>
+      </w:r>
+      <w:proofErr w:type="spellEnd"/>
+      <w:r>
+        <w:rPr>
+          <w:rFonts w:ascii="Times New Roman" w:hAnsi="Times New Roman" w:cs="Times New Roman"/>
+          <w:b/>
+          <w:bCs/>
+          <w:szCs w:val="22"/>
+        </w:rPr>
+        <w:t xml:space="preserve"> &amp; Outbreak Forecasting Challenges</w:t>
+      </w:r>
+    </w:p>
+    <w:p>
+      <w:pPr>
+        <w:numPr>
+          <w:ilvl w:val="0"/>
+          <w:numId w:val="122"/>
+        </w:numPr>
+        <w:rPr>
+          <w:rFonts w:ascii="Times New Roman" w:hAnsi="Times New Roman" w:cs="Times New Roman"/>
+          <w:szCs w:val="22"/>
+        </w:rPr>
+      </w:pPr>
+      <w:r>
+        <w:rPr>
+          <w:rFonts w:ascii="Times New Roman" w:hAnsi="Times New Roman" w:cs="Times New Roman"/>
+          <w:b/>
+          <w:bCs/>
+          <w:szCs w:val="22"/>
+        </w:rPr>
+        <w:t xml:space="preserve">How challenging is it for your team to connect genomic changes with real-world outbreak </w:t>
+      </w:r>
+      <w:proofErr w:type="spellStart"/>
+      <w:r>
+        <w:rPr>
+          <w:rFonts w:ascii="Times New Roman" w:hAnsi="Times New Roman" w:cs="Times New Roman"/>
+          <w:b/>
+          <w:bCs/>
+          <w:szCs w:val="22"/>
+        </w:rPr>
+        <w:t>modeling</w:t>
+      </w:r>
+      <w:proofErr w:type="spellEnd"/>
+      <w:r>
+        <w:rPr>
+          <w:rFonts w:ascii="Times New Roman" w:hAnsi="Times New Roman" w:cs="Times New Roman"/>
+          <w:b/>
+          <w:bCs/>
+          <w:szCs w:val="22"/>
+        </w:rPr>
+        <w:t xml:space="preserve"> (SEIR/SIR)?</w:t>
+      </w:r>
+      <w:r>
+        <w:rPr>
+          <w:rFonts w:ascii="Times New Roman" w:hAnsi="Times New Roman" w:cs="Times New Roman"/>
+          <w:szCs w:val="22"/>
+        </w:rPr>
+        <w:br/>
+        <w:t>(VIRO-AI integrates mutation-adjusted SEIR forecasting)</w:t>
+      </w:r>
+    </w:p>
+    <w:p>
+      <w:pPr>
+        <w:numPr>
+          <w:ilvl w:val="0"/>
+          <w:numId w:val="122"/>
+        </w:numPr>
+        <w:rPr>
+          <w:rFonts w:ascii="Times New Roman" w:hAnsi="Times New Roman" w:cs="Times New Roman"/>
+          <w:szCs w:val="22"/>
+        </w:rPr>
+      </w:pPr>
+      <w:r>
+        <w:rPr>
+          <w:rFonts w:ascii="Times New Roman" w:hAnsi="Times New Roman" w:cs="Times New Roman"/>
+          <w:b/>
+          <w:bCs/>
+          <w:szCs w:val="22"/>
+        </w:rPr>
+        <w:t>What barriers exist in generating district- or state-level outbreak predictions from genomic surveillance feeds?</w:t>
+      </w:r>
+    </w:p>
+    <w:p>
+      <w:pPr>
+        <w:numPr>
+          <w:ilvl w:val="0"/>
+          <w:numId w:val="122"/>
+        </w:numPr>
+        <w:rPr>
+          <w:rFonts w:ascii="Times New Roman" w:hAnsi="Times New Roman" w:cs="Times New Roman"/>
+          <w:szCs w:val="22"/>
+        </w:rPr>
+      </w:pPr>
+      <w:r>
+        <w:rPr>
+          <w:rFonts w:ascii="Times New Roman" w:hAnsi="Times New Roman" w:cs="Times New Roman"/>
+          <w:b/>
+          <w:bCs/>
+          <w:szCs w:val="22"/>
+        </w:rPr>
+        <w:t>Do you need real-time dashboards that integrate R₀, viral deadliness score, and mobility data?</w:t>
+      </w:r>
+      <w:r>
+        <w:rPr>
+          <w:rFonts w:ascii="Times New Roman" w:hAnsi="Times New Roman" w:cs="Times New Roman"/>
+          <w:szCs w:val="22"/>
+        </w:rPr>
+        <w:br/>
+        <w:t>(Deadliness Score Index = VIRO-AI core USP)</w:t>
+      </w:r>
+    </w:p>
+    <w:p>
+      <w:pPr>
+        <w:rPr>
+          <w:rFonts w:ascii="Times New Roman" w:hAnsi="Times New Roman" w:cs="Times New Roman"/>
+          <w:szCs w:val="22"/>
+        </w:rPr>
+      </w:pPr>
+    </w:p>
+    <w:p>
+      <w:pPr>
+        <w:rPr>
+          <w:rFonts w:ascii="Times New Roman" w:hAnsi="Times New Roman" w:cs="Times New Roman"/>
+          <w:szCs w:val="22"/>
+        </w:rPr>
+      </w:pPr>
+    </w:p>
+    <w:p>
+      <w:pPr>
+        <w:rPr>
+          <w:rFonts w:ascii="Times New Roman" w:hAnsi="Times New Roman" w:cs="Times New Roman"/>
+          <w:b/>
+          <w:bCs/>
+          <w:szCs w:val="22"/>
+        </w:rPr>
+      </w:pPr>
+      <w:r>
+        <w:rPr>
+          <w:rFonts w:ascii="Times New Roman" w:hAnsi="Times New Roman" w:cs="Times New Roman"/>
+          <w:b/>
+          <w:bCs/>
+          <w:szCs w:val="22"/>
+        </w:rPr>
+        <w:lastRenderedPageBreak/>
+        <w:t>SECTION 6 — Data Integration, Ontologies, &amp; Translational Clinical Insights</w:t>
+      </w:r>
+    </w:p>
+    <w:p>
+      <w:pPr>
+        <w:numPr>
+          <w:ilvl w:val="0"/>
+          <w:numId w:val="123"/>
+        </w:numPr>
+        <w:rPr>
+          <w:rFonts w:ascii="Times New Roman" w:hAnsi="Times New Roman" w:cs="Times New Roman"/>
+          <w:szCs w:val="22"/>
+        </w:rPr>
+      </w:pPr>
+      <w:r>
+        <w:rPr>
+          <w:rFonts w:ascii="Times New Roman" w:hAnsi="Times New Roman" w:cs="Times New Roman"/>
+          <w:b/>
+          <w:bCs/>
+          <w:szCs w:val="22"/>
+        </w:rPr>
+        <w:t>Do fragmented datasets (genomic, proteomic, metabolomic, clinical, trial, epidemiological) limit the speed of your research?</w:t>
+      </w:r>
+      <w:r>
+        <w:rPr>
+          <w:rFonts w:ascii="Times New Roman" w:hAnsi="Times New Roman" w:cs="Times New Roman"/>
+          <w:szCs w:val="22"/>
+        </w:rPr>
+        <w:br/>
+        <w:t>(Current problem stated in project)</w:t>
+      </w:r>
+    </w:p>
+    <w:p>
+      <w:pPr>
+        <w:numPr>
+          <w:ilvl w:val="0"/>
+          <w:numId w:val="123"/>
+        </w:numPr>
+        <w:rPr>
+          <w:rFonts w:ascii="Times New Roman" w:hAnsi="Times New Roman" w:cs="Times New Roman"/>
+          <w:szCs w:val="22"/>
+        </w:rPr>
+      </w:pPr>
+      <w:r>
+        <w:rPr>
+          <w:rFonts w:ascii="Times New Roman" w:hAnsi="Times New Roman" w:cs="Times New Roman"/>
+          <w:b/>
+          <w:bCs/>
+          <w:szCs w:val="22"/>
+        </w:rPr>
+        <w:t xml:space="preserve">How difficult is it to connect mutation-level insights with symptom clusters using ontologies (UMLS, SNOMED CT, </w:t>
+      </w:r>
+      <w:proofErr w:type="spellStart"/>
+      <w:r>
+        <w:rPr>
+          <w:rFonts w:ascii="Times New Roman" w:hAnsi="Times New Roman" w:cs="Times New Roman"/>
+          <w:b/>
+          <w:bCs/>
+          <w:szCs w:val="22"/>
+        </w:rPr>
+        <w:t>MeSH</w:t>
+      </w:r>
+      <w:proofErr w:type="spellEnd"/>
+      <w:r>
+        <w:rPr>
+          <w:rFonts w:ascii="Times New Roman" w:hAnsi="Times New Roman" w:cs="Times New Roman"/>
+          <w:b/>
+          <w:bCs/>
+          <w:szCs w:val="22"/>
+        </w:rPr>
+        <w:t>)?</w:t>
+      </w:r>
+      <w:r>
+        <w:rPr>
+          <w:rFonts w:ascii="Times New Roman" w:hAnsi="Times New Roman" w:cs="Times New Roman"/>
+          <w:szCs w:val="22"/>
+        </w:rPr>
+        <w:br/>
+        <w:t>(VIRO-AI connects these with a knowledge graph)</w:t>
+      </w:r>
+    </w:p>
+    <w:p>
+      <w:pPr>
+        <w:numPr>
+          <w:ilvl w:val="0"/>
+          <w:numId w:val="123"/>
+        </w:numPr>
+        <w:rPr>
+          <w:rFonts w:ascii="Times New Roman" w:hAnsi="Times New Roman" w:cs="Times New Roman"/>
+          <w:szCs w:val="22"/>
+        </w:rPr>
+      </w:pPr>
+      <w:r>
+        <w:rPr>
+          <w:rFonts w:ascii="Times New Roman" w:hAnsi="Times New Roman" w:cs="Times New Roman"/>
+          <w:b/>
+          <w:bCs/>
+          <w:szCs w:val="22"/>
+        </w:rPr>
+        <w:t>Would access to a unified pipeline (mutation → structural shift → symptom mapping → preventive measures) significantly accelerate your research?</w:t>
+      </w:r>
+    </w:p>
+    <w:p>
+      <w:pPr>
+        <w:rPr>
+          <w:rFonts w:ascii="Times New Roman" w:hAnsi="Times New Roman" w:cs="Times New Roman"/>
+          <w:szCs w:val="22"/>
+        </w:rPr>
+      </w:pPr>
+    </w:p>
+    <w:p>
+      <w:pPr>
+        <w:rPr>
+          <w:rFonts w:ascii="Times New Roman" w:hAnsi="Times New Roman" w:cs="Times New Roman"/>
+          <w:b/>
+          <w:bCs/>
+          <w:szCs w:val="22"/>
+        </w:rPr>
+      </w:pPr>
+      <w:r>
+        <w:rPr>
+          <w:rFonts w:ascii="Times New Roman" w:hAnsi="Times New Roman" w:cs="Times New Roman"/>
+          <w:b/>
+          <w:bCs/>
+          <w:szCs w:val="22"/>
+        </w:rPr>
+        <w:t>SECTION 7 — Introducing VIRO-AI: Feedback &amp; Impact Assessment</w:t>
+      </w:r>
+    </w:p>
+    <w:p>
+      <w:pPr>
+        <w:numPr>
+          <w:ilvl w:val="0"/>
+          <w:numId w:val="124"/>
+        </w:numPr>
+        <w:rPr>
+          <w:rFonts w:ascii="Times New Roman" w:hAnsi="Times New Roman" w:cs="Times New Roman"/>
+          <w:szCs w:val="22"/>
+        </w:rPr>
+      </w:pPr>
+      <w:r>
+        <w:rPr>
+          <w:rFonts w:ascii="Times New Roman" w:hAnsi="Times New Roman" w:cs="Times New Roman"/>
+          <w:b/>
+          <w:bCs/>
+          <w:szCs w:val="22"/>
+        </w:rPr>
+        <w:t xml:space="preserve">Based on the system overview — predictive mutation </w:t>
+      </w:r>
+      <w:proofErr w:type="spellStart"/>
+      <w:r>
+        <w:rPr>
+          <w:rFonts w:ascii="Times New Roman" w:hAnsi="Times New Roman" w:cs="Times New Roman"/>
+          <w:b/>
+          <w:bCs/>
+          <w:szCs w:val="22"/>
+        </w:rPr>
+        <w:t>modeling</w:t>
+      </w:r>
+      <w:proofErr w:type="spellEnd"/>
+      <w:r>
+        <w:rPr>
+          <w:rFonts w:ascii="Times New Roman" w:hAnsi="Times New Roman" w:cs="Times New Roman"/>
+          <w:b/>
+          <w:bCs/>
+          <w:szCs w:val="22"/>
+        </w:rPr>
+        <w:t>, protein simulations, drug design, in-silico trials, outbreak forecasting, and 3D visualization — which modules do you find most impactful?</w:t>
+      </w:r>
+      <w:r>
+        <w:rPr>
+          <w:rFonts w:ascii="Times New Roman" w:hAnsi="Times New Roman" w:cs="Times New Roman"/>
+          <w:szCs w:val="22"/>
+        </w:rPr>
+        <w:br/>
+        <w:t>(System Architecture)</w:t>
+      </w:r>
+    </w:p>
+    <w:p>
+      <w:pPr>
+        <w:numPr>
+          <w:ilvl w:val="0"/>
+          <w:numId w:val="124"/>
+        </w:numPr>
+        <w:rPr>
+          <w:rFonts w:ascii="Times New Roman" w:hAnsi="Times New Roman" w:cs="Times New Roman"/>
+          <w:szCs w:val="22"/>
+        </w:rPr>
+      </w:pPr>
+      <w:r>
+        <w:rPr>
+          <w:rFonts w:ascii="Times New Roman" w:hAnsi="Times New Roman" w:cs="Times New Roman"/>
+          <w:b/>
+          <w:bCs/>
+          <w:szCs w:val="22"/>
+        </w:rPr>
+        <w:t>Do you believe VIRO-AI’s integrated platform could help transition virology from reactive to predictive science?</w:t>
+      </w:r>
+      <w:r>
+        <w:rPr>
+          <w:rFonts w:ascii="Times New Roman" w:hAnsi="Times New Roman" w:cs="Times New Roman"/>
+          <w:szCs w:val="22"/>
+        </w:rPr>
+        <w:br/>
+        <w:t>(Key USP)</w:t>
+      </w:r>
+    </w:p>
+    <w:p>
+      <w:pPr>
+        <w:numPr>
+          <w:ilvl w:val="0"/>
+          <w:numId w:val="124"/>
+        </w:numPr>
+        <w:rPr>
+          <w:rFonts w:ascii="Times New Roman" w:hAnsi="Times New Roman" w:cs="Times New Roman"/>
+          <w:szCs w:val="22"/>
+        </w:rPr>
+      </w:pPr>
+      <w:r>
+        <w:rPr>
+          <w:rFonts w:ascii="Times New Roman" w:hAnsi="Times New Roman" w:cs="Times New Roman"/>
+          <w:b/>
+          <w:bCs/>
+          <w:szCs w:val="22"/>
+        </w:rPr>
+        <w:t>How significantly could an end-to-end platform like VIRO-AI reduce research time, experimental cost, and risk in your work?</w:t>
+      </w:r>
+    </w:p>
+    <w:p>
+      <w:pPr>
+        <w:numPr>
+          <w:ilvl w:val="0"/>
+          <w:numId w:val="124"/>
+        </w:numPr>
+        <w:rPr>
+          <w:rFonts w:ascii="Times New Roman" w:hAnsi="Times New Roman" w:cs="Times New Roman"/>
+          <w:szCs w:val="22"/>
+        </w:rPr>
+      </w:pPr>
+      <w:r>
+        <w:rPr>
+          <w:rFonts w:ascii="Times New Roman" w:hAnsi="Times New Roman" w:cs="Times New Roman"/>
+          <w:b/>
+          <w:bCs/>
+          <w:szCs w:val="22"/>
+        </w:rPr>
+        <w:t>Would AI-powered mutation prediction + drug design pipelines (months → days) change how your lab approaches antiviral development?</w:t>
+      </w:r>
+      <w:r>
+        <w:rPr>
+          <w:rFonts w:ascii="Times New Roman" w:hAnsi="Times New Roman" w:cs="Times New Roman"/>
+          <w:szCs w:val="22"/>
+        </w:rPr>
+        <w:br/>
+        <w:t>(Benefits &amp; Impact)</w:t>
+      </w:r>
+    </w:p>
+    <w:p>
+      <w:pPr>
+        <w:numPr>
+          <w:ilvl w:val="0"/>
+          <w:numId w:val="124"/>
+        </w:numPr>
+        <w:rPr>
+          <w:rFonts w:ascii="Times New Roman" w:hAnsi="Times New Roman" w:cs="Times New Roman"/>
+          <w:szCs w:val="22"/>
+        </w:rPr>
+      </w:pPr>
+      <w:r>
+        <w:rPr>
+          <w:rFonts w:ascii="Times New Roman" w:hAnsi="Times New Roman" w:cs="Times New Roman"/>
+          <w:b/>
+          <w:bCs/>
+          <w:szCs w:val="22"/>
+        </w:rPr>
+        <w:t>Could VIRO-AI’s Deadliness Score and outbreak forecasting models help your institution prepare for future pandemics?</w:t>
+      </w:r>
+    </w:p>
+    <w:p>
+      <w:pPr>
+        <w:numPr>
+          <w:ilvl w:val="0"/>
+          <w:numId w:val="124"/>
+        </w:numPr>
+        <w:rPr>
+          <w:rFonts w:ascii="Times New Roman" w:hAnsi="Times New Roman" w:cs="Times New Roman"/>
+          <w:szCs w:val="22"/>
+        </w:rPr>
+      </w:pPr>
+      <w:r>
+        <w:rPr>
+          <w:rFonts w:ascii="Times New Roman" w:hAnsi="Times New Roman" w:cs="Times New Roman"/>
+          <w:b/>
+          <w:bCs/>
+          <w:szCs w:val="22"/>
+        </w:rPr>
+        <w:t>Do you foresee this system setting a new global standard in computational virology? Why or why not?</w:t>
+      </w:r>
+    </w:p>
+    <w:p>
+      <w:pPr>
+        <w:numPr>
+          <w:ilvl w:val="0"/>
+          <w:numId w:val="124"/>
+        </w:numPr>
+        <w:rPr>
+          <w:rFonts w:ascii="Times New Roman" w:hAnsi="Times New Roman" w:cs="Times New Roman"/>
+          <w:szCs w:val="22"/>
+        </w:rPr>
+      </w:pPr>
+      <w:r>
+        <w:rPr>
+          <w:rFonts w:ascii="Times New Roman" w:hAnsi="Times New Roman" w:cs="Times New Roman"/>
+          <w:b/>
+          <w:bCs/>
+          <w:szCs w:val="22"/>
+        </w:rPr>
+        <w:t>Would you adopt VIRO-AI in your workflows if accessible through cloud SaaS, API integrations, and real-time dashboards?</w:t>
+      </w:r>
+    </w:p>
+    <w:p>
+      <w:pPr>
+        <w:numPr>
+          <w:ilvl w:val="0"/>
+          <w:numId w:val="124"/>
+        </w:numPr>
+        <w:rPr>
+          <w:rFonts w:ascii="Times New Roman" w:hAnsi="Times New Roman" w:cs="Times New Roman"/>
+          <w:szCs w:val="22"/>
+        </w:rPr>
+      </w:pPr>
+      <w:r>
+        <w:rPr>
+          <w:rFonts w:ascii="Times New Roman" w:hAnsi="Times New Roman" w:cs="Times New Roman"/>
+          <w:b/>
+          <w:bCs/>
+          <w:szCs w:val="22"/>
+        </w:rPr>
+        <w:t>In your opinion, can VIRO-AI meaningfully reduce global mortality and economic loss during viral outbreaks?</w:t>
+      </w:r>
+      <w:r>
+        <w:rPr>
+          <w:rFonts w:ascii="Times New Roman" w:hAnsi="Times New Roman" w:cs="Times New Roman"/>
+          <w:szCs w:val="22"/>
+        </w:rPr>
+        <w:br/>
+        <w:t>(Conclusion)</w:t>
+      </w:r>
+    </w:p>
+    <w:p>
+      <w:pPr>
+        <w:rPr>
+          <w:rFonts w:ascii="Times New Roman" w:hAnsi="Times New Roman" w:cs="Times New Roman"/>
+          <w:szCs w:val="22"/>
+        </w:rPr>
+      </w:pPr>
+    </w:p>
+    <w:p>
+      <w:pPr>
+        <w:rPr>
+          <w:rFonts w:ascii="Times New Roman" w:hAnsi="Times New Roman" w:cs="Times New Roman"/>
+          <w:b/>
+          <w:bCs/>
+          <w:szCs w:val="22"/>
+        </w:rPr>
+      </w:pPr>
+      <w:r>
+        <w:rPr>
+          <w:rFonts w:ascii="Times New Roman" w:hAnsi="Times New Roman" w:cs="Times New Roman"/>
+          <w:b/>
+          <w:bCs/>
+          <w:szCs w:val="22"/>
+        </w:rPr>
+        <w:t>SECTION 8 — Final Open-Ended Expert Insights</w:t>
+      </w:r>
+    </w:p>
+    <w:p>
+      <w:pPr>
+        <w:numPr>
+          <w:ilvl w:val="0"/>
+          <w:numId w:val="125"/>
+        </w:numPr>
+        <w:rPr>
+          <w:rFonts w:ascii="Times New Roman" w:hAnsi="Times New Roman" w:cs="Times New Roman"/>
+          <w:szCs w:val="22"/>
+        </w:rPr>
+      </w:pPr>
+      <w:r>
+        <w:rPr>
+          <w:rFonts w:ascii="Times New Roman" w:hAnsi="Times New Roman" w:cs="Times New Roman"/>
+          <w:b/>
+          <w:bCs/>
+          <w:szCs w:val="22"/>
+        </w:rPr>
+        <w:t>What unsolved problems in virology do you believe VIRO-AI should prioritize next?</w:t>
+      </w:r>
+    </w:p>
+    <w:p>
+      <w:pPr>
+        <w:numPr>
+          <w:ilvl w:val="0"/>
+          <w:numId w:val="125"/>
+        </w:numPr>
+        <w:rPr>
+          <w:rFonts w:ascii="Times New Roman" w:hAnsi="Times New Roman" w:cs="Times New Roman"/>
+          <w:szCs w:val="22"/>
+        </w:rPr>
+      </w:pPr>
+      <w:r>
+        <w:rPr>
+          <w:rFonts w:ascii="Times New Roman" w:hAnsi="Times New Roman" w:cs="Times New Roman"/>
+          <w:b/>
+          <w:bCs/>
+          <w:szCs w:val="22"/>
+        </w:rPr>
+        <w:t>How can this platform better support:</w:t>
+      </w:r>
+    </w:p>
+    <w:p>
+      <w:pPr>
+        <w:numPr>
+          <w:ilvl w:val="0"/>
+          <w:numId w:val="126"/>
+        </w:numPr>
+        <w:rPr>
+          <w:rFonts w:ascii="Times New Roman" w:hAnsi="Times New Roman" w:cs="Times New Roman"/>
+          <w:szCs w:val="22"/>
+        </w:rPr>
+      </w:pPr>
+      <w:r>
+        <w:rPr>
+          <w:rFonts w:ascii="Times New Roman" w:hAnsi="Times New Roman" w:cs="Times New Roman"/>
+          <w:szCs w:val="22"/>
+        </w:rPr>
+        <w:t>High-mutation-rate RNA viruses</w:t>
+      </w:r>
+    </w:p>
+    <w:p>
+      <w:pPr>
+        <w:numPr>
+          <w:ilvl w:val="0"/>
+          <w:numId w:val="126"/>
+        </w:numPr>
+        <w:rPr>
+          <w:rFonts w:ascii="Times New Roman" w:hAnsi="Times New Roman" w:cs="Times New Roman"/>
+          <w:szCs w:val="22"/>
+        </w:rPr>
+      </w:pPr>
+      <w:r>
+        <w:rPr>
+          <w:rFonts w:ascii="Times New Roman" w:hAnsi="Times New Roman" w:cs="Times New Roman"/>
+          <w:szCs w:val="22"/>
+        </w:rPr>
+        <w:t>Zoonotic spillover detection</w:t>
+      </w:r>
+    </w:p>
+    <w:p>
+      <w:pPr>
+        <w:numPr>
+          <w:ilvl w:val="0"/>
+          <w:numId w:val="126"/>
+        </w:numPr>
+        <w:rPr>
+          <w:rFonts w:ascii="Times New Roman" w:hAnsi="Times New Roman" w:cs="Times New Roman"/>
+          <w:szCs w:val="22"/>
+        </w:rPr>
+      </w:pPr>
+      <w:r>
+        <w:rPr>
+          <w:rFonts w:ascii="Times New Roman" w:hAnsi="Times New Roman" w:cs="Times New Roman"/>
+          <w:szCs w:val="22"/>
+        </w:rPr>
+        <w:t>Vaccine escape surveillance</w:t>
+      </w:r>
+    </w:p>
+    <w:p>
+      <w:pPr>
+        <w:numPr>
+          <w:ilvl w:val="0"/>
+          <w:numId w:val="126"/>
+        </w:numPr>
+        <w:rPr>
+          <w:rFonts w:ascii="Times New Roman" w:hAnsi="Times New Roman" w:cs="Times New Roman"/>
+          <w:szCs w:val="22"/>
+        </w:rPr>
+      </w:pPr>
+      <w:r>
+        <w:rPr>
+          <w:rFonts w:ascii="Times New Roman" w:hAnsi="Times New Roman" w:cs="Times New Roman"/>
+          <w:szCs w:val="22"/>
+        </w:rPr>
+        <w:lastRenderedPageBreak/>
+        <w:t>Rapid therapeutic countermeasure development</w:t>
+      </w:r>
+    </w:p>
+    <w:p>
+      <w:pPr>
+        <w:numPr>
+          <w:ilvl w:val="0"/>
+          <w:numId w:val="127"/>
+        </w:numPr>
+        <w:rPr>
+          <w:rFonts w:ascii="Times New Roman" w:hAnsi="Times New Roman" w:cs="Times New Roman"/>
+          <w:szCs w:val="22"/>
+        </w:rPr>
+      </w:pPr>
+      <w:r>
+        <w:rPr>
+          <w:rFonts w:ascii="Times New Roman" w:hAnsi="Times New Roman" w:cs="Times New Roman"/>
+          <w:b/>
+          <w:bCs/>
+          <w:szCs w:val="22"/>
+        </w:rPr>
+        <w:t>What enhancements would make VIRO-AI indispensable in your daily research?</w:t>
+      </w:r>
+    </w:p>
+    <w:p>
+      <w:pPr>
+        <w:rPr>
+          <w:rFonts w:ascii="Times New Roman" w:hAnsi="Times New Roman" w:cs="Times New Roman"/>
+          <w:szCs w:val="22"/>
         </w:rPr>
       </w:pPr>
     </w:p>
@@ -184,6 +1727,155 @@
 <file path=word/numbering.xml><?xml version="1.0" encoding="utf-8"?>
 <w:numbering xmlns:wpc="http://schemas.microsoft.com/office/word/2010/wordprocessingCanvas" xmlns:cx="http://schemas.microsoft.com/office/drawing/2014/chartex" xmlns:cx1="http://schemas.microsoft.com/office/drawing/2015/9/8/chartex" xmlns:cx2="http://schemas.microsoft.com/office/drawing/2015/10/21/chartex" xmlns:cx3="http://schemas.microsoft.com/office/drawing/2016/5/9/chartex" xmlns:cx4="http://schemas.microsoft.com/office/drawing/2016/5/10/chartex" xmlns:cx5="http://schemas.microsoft.com/office/drawing/2016/5/11/chartex" xmlns:cx6="http://schemas.microsoft.com/office/drawing/2016/5/12/chartex" xmlns:cx7="http://schemas.microsoft.com/office/drawing/2016/5/13/chartex" xmlns:cx8="http://schemas.microsoft.com/office/drawing/2016/5/14/chartex" xmlns:mc="http://schemas.openxmlformats.org/markup-compatibility/2006" xmlns:aink="http://schemas.microsoft.com/office/drawing/2016/ink" xmlns:am3d="http://schemas.microsoft.com/office/drawing/2017/model3d" xmlns:o="urn:schemas-microsoft-com:office:office" xmlns:oel="http://schemas.microsoft.com/office/2019/extlst" xmlns:r="http://schemas.openxmlformats.org/officeDocument/2006/relationships" xmlns:m="http://schemas.openxmlformats.org/officeDocument/2006/math" xmlns:v="urn:schemas-microsoft-com:vml" xmlns:wp14="http://schemas.microsoft.com/office/word/2010/wordprocessingDrawing" xmlns:wp="http://schemas.openxmlformats.org/drawingml/2006/wordprocessingDrawing" xmlns:w10="urn:schemas-microsoft-com:office:word" xmlns:w="http://schemas.openxmlformats.org/wordprocessingml/2006/main" xmlns:w14="http://schemas.microsoft.com/office/word/2010/wordml" xmlns:w15="http://schemas.microsoft.com/office/word/2012/wordml" xmlns:w16cex="http://schemas.microsoft.com/office/word/2018/wordml/cex" xmlns:w16cid="http://schemas.microsoft.com/office/word/2016/wordml/cid" xmlns:w16="http://schemas.microsoft.com/office/word/2018/wordml" xmlns:w16du="http://schemas.microsoft.com/office/word/2023/wordml/word16du" xmlns:w16sdtdh="http://schemas.microsoft.com/office/word/2020/wordml/sdtdatahash" xmlns:w16sdtfl="http://schemas.microsoft.com/office/word/2024/wordml/sdtformatlock" xmlns:w16se="http://schemas.microsoft.com/office/word/2015/wordml/symex" xmlns:wpg="http://schemas.microsoft.com/office/word/2010/wordprocessingGroup" xmlns:wpi="http://schemas.microsoft.com/office/word/2010/wordprocessingInk" xmlns:wne="http://schemas.microsoft.com/office/word/2006/wordml" xmlns:wps="http://schemas.microsoft.com/office/word/2010/wordprocessingShape" mc:Ignorable="w14 w15 w16se w16cid w16 w16cex w16sdtdh w16sdtfl w16du wp14">
   <w:abstractNum w:abstractNumId="0" w15:restartNumberingAfterBreak="0">
+    <w:nsid w:val="007B2939"/>
+    <w:multiLevelType w:val="multilevel"/>
+    <w:tmpl w:val="71E24A60"/>
+    <w:lvl w:ilvl="0">
+      <w:start w:val="1"/>
+      <w:numFmt w:val="bullet"/>
+      <w:lvlText w:val=""/>
+      <w:lvlJc w:val="left"/>
+      <w:pPr>
+        <w:tabs>
+          <w:tab w:val="num" w:pos="720"/>
+        </w:tabs>
+        <w:ind w:left="720" w:hanging="360"/>
+      </w:pPr>
+      <w:rPr>
+        <w:rFonts w:ascii="Symbol" w:hAnsi="Symbol" w:hint="default"/>
+        <w:sz w:val="20"/>
+      </w:rPr>
+    </w:lvl>
+    <w:lvl w:ilvl="1" w:tentative="1">
+      <w:start w:val="1"/>
+      <w:numFmt w:val="bullet"/>
+      <w:lvlText w:val="o"/>
+      <w:lvlJc w:val="left"/>
+      <w:pPr>
+        <w:tabs>
+          <w:tab w:val="num" w:pos="1440"/>
+        </w:tabs>
+        <w:ind w:left="1440" w:hanging="360"/>
+      </w:pPr>
+      <w:rPr>
+        <w:rFonts w:ascii="Courier New" w:hAnsi="Courier New" w:hint="default"/>
+        <w:sz w:val="20"/>
+      </w:rPr>
+    </w:lvl>
+    <w:lvl w:ilvl="2" w:tentative="1">
+      <w:start w:val="1"/>
+      <w:numFmt w:val="bullet"/>
+      <w:lvlText w:val=""/>
+      <w:lvlJc w:val="left"/>
+      <w:pPr>
+        <w:tabs>
+          <w:tab w:val="num" w:pos="2160"/>
+        </w:tabs>
+        <w:ind w:left="2160" w:hanging="360"/>
+      </w:pPr>
+      <w:rPr>
+        <w:rFonts w:ascii="Wingdings" w:hAnsi="Wingdings" w:hint="default"/>
+        <w:sz w:val="20"/>
+      </w:rPr>
+    </w:lvl>
+    <w:lvl w:ilvl="3" w:tentative="1">
+      <w:start w:val="1"/>
+      <w:numFmt w:val="bullet"/>
+      <w:lvlText w:val=""/>
+      <w:lvlJc w:val="left"/>
+      <w:pPr>
+        <w:tabs>
+          <w:tab w:val="num" w:pos="2880"/>
+        </w:tabs>
+        <w:ind w:left="2880" w:hanging="360"/>
+      </w:pPr>
+      <w:rPr>
+        <w:rFonts w:ascii="Wingdings" w:hAnsi="Wingdings" w:hint="default"/>
+        <w:sz w:val="20"/>
+      </w:rPr>
+    </w:lvl>
+    <w:lvl w:ilvl="4" w:tentative="1">
+      <w:start w:val="1"/>
+      <w:numFmt w:val="bullet"/>
+      <w:lvlText w:val=""/>
+      <w:lvlJc w:val="left"/>
+      <w:pPr>
+        <w:tabs>
+          <w:tab w:val="num" w:pos="3600"/>
+        </w:tabs>
+        <w:ind w:left="3600" w:hanging="360"/>
+      </w:pPr>
+      <w:rPr>
+        <w:rFonts w:ascii="Wingdings" w:hAnsi="Wingdings" w:hint="default"/>
+        <w:sz w:val="20"/>
+      </w:rPr>
+    </w:lvl>
+    <w:lvl w:ilvl="5" w:tentative="1">
+      <w:start w:val="1"/>
+      <w:numFmt w:val="bullet"/>
+      <w:lvlText w:val=""/>
+      <w:lvlJc w:val="left"/>
+      <w:pPr>
+        <w:tabs>
+          <w:tab w:val="num" w:pos="4320"/>
+        </w:tabs>
+        <w:ind w:left="4320" w:hanging="360"/>
+      </w:pPr>
+      <w:rPr>
+        <w:rFonts w:ascii="Wingdings" w:hAnsi="Wingdings" w:hint="default"/>
+        <w:sz w:val="20"/>
+      </w:rPr>
+    </w:lvl>
+    <w:lvl w:ilvl="6" w:tentative="1">
+      <w:start w:val="1"/>
+      <w:numFmt w:val="bullet"/>
+      <w:lvlText w:val=""/>
+      <w:lvlJc w:val="left"/>
+      <w:pPr>
+        <w:tabs>
+          <w:tab w:val="num" w:pos="5040"/>
+        </w:tabs>
+        <w:ind w:left="5040" w:hanging="360"/>
+      </w:pPr>
+      <w:rPr>
+        <w:rFonts w:ascii="Wingdings" w:hAnsi="Wingdings" w:hint="default"/>
+        <w:sz w:val="20"/>
+      </w:rPr>
+    </w:lvl>
+    <w:lvl w:ilvl="7" w:tentative="1">
+      <w:start w:val="1"/>
+      <w:numFmt w:val="bullet"/>
+      <w:lvlText w:val=""/>
+      <w:lvlJc w:val="left"/>
+      <w:pPr>
+        <w:tabs>
+          <w:tab w:val="num" w:pos="5760"/>
+        </w:tabs>
+        <w:ind w:left="5760" w:hanging="360"/>
+      </w:pPr>
+      <w:rPr>
+        <w:rFonts w:ascii="Wingdings" w:hAnsi="Wingdings" w:hint="default"/>
+        <w:sz w:val="20"/>
+      </w:rPr>
+    </w:lvl>
+    <w:lvl w:ilvl="8" w:tentative="1">
+      <w:start w:val="1"/>
+      <w:numFmt w:val="bullet"/>
+      <w:lvlText w:val=""/>
+      <w:lvlJc w:val="left"/>
+      <w:pPr>
+        <w:tabs>
+          <w:tab w:val="num" w:pos="6480"/>
+        </w:tabs>
+        <w:ind w:left="6480" w:hanging="360"/>
+      </w:pPr>
+      <w:rPr>
+        <w:rFonts w:ascii="Wingdings" w:hAnsi="Wingdings" w:hint="default"/>
+        <w:sz w:val="20"/>
+      </w:rPr>
+    </w:lvl>
+  </w:abstractNum>
+  <w:abstractNum w:abstractNumId="1" w15:restartNumberingAfterBreak="0">
     <w:nsid w:val="019D15B4"/>
     <w:multiLevelType w:val="hybridMultilevel"/>
     <w:tmpl w:val="90767872"/>
@@ -296,7 +1988,7 @@
       </w:rPr>
     </w:lvl>
   </w:abstractNum>
-  <w:abstractNum w:abstractNumId="1" w15:restartNumberingAfterBreak="0">
+  <w:abstractNum w:abstractNumId="2" w15:restartNumberingAfterBreak="0">
     <w:nsid w:val="02C14559"/>
     <w:multiLevelType w:val="hybridMultilevel"/>
     <w:tmpl w:val="5D4CBF2C"/>
@@ -409,7 +2101,7 @@
       </w:rPr>
     </w:lvl>
   </w:abstractNum>
-  <w:abstractNum w:abstractNumId="2" w15:restartNumberingAfterBreak="0">
+  <w:abstractNum w:abstractNumId="3" w15:restartNumberingAfterBreak="0">
     <w:nsid w:val="03AE4D5E"/>
     <w:multiLevelType w:val="hybridMultilevel"/>
     <w:tmpl w:val="9B3E0F36"/>
@@ -522,7 +2214,7 @@
       </w:rPr>
     </w:lvl>
   </w:abstractNum>
-  <w:abstractNum w:abstractNumId="3" w15:restartNumberingAfterBreak="0">
+  <w:abstractNum w:abstractNumId="4" w15:restartNumberingAfterBreak="0">
     <w:nsid w:val="056B10C6"/>
     <w:multiLevelType w:val="hybridMultilevel"/>
     <w:tmpl w:val="535A0400"/>
@@ -635,7 +2327,7 @@
       </w:rPr>
     </w:lvl>
   </w:abstractNum>
-  <w:abstractNum w:abstractNumId="4" w15:restartNumberingAfterBreak="0">
+  <w:abstractNum w:abstractNumId="5" w15:restartNumberingAfterBreak="0">
     <w:nsid w:val="05AA6CBC"/>
     <w:multiLevelType w:val="hybridMultilevel"/>
     <w:tmpl w:val="651A1D0E"/>
@@ -748,7 +2440,7 @@
       </w:rPr>
     </w:lvl>
   </w:abstractNum>
-  <w:abstractNum w:abstractNumId="5" w15:restartNumberingAfterBreak="0">
+  <w:abstractNum w:abstractNumId="6" w15:restartNumberingAfterBreak="0">
     <w:nsid w:val="05CE5DBE"/>
     <w:multiLevelType w:val="hybridMultilevel"/>
     <w:tmpl w:val="21D2F086"/>
@@ -861,7 +2553,7 @@
       </w:rPr>
     </w:lvl>
   </w:abstractNum>
-  <w:abstractNum w:abstractNumId="6" w15:restartNumberingAfterBreak="0">
+  <w:abstractNum w:abstractNumId="7" w15:restartNumberingAfterBreak="0">
     <w:nsid w:val="05E60B9C"/>
     <w:multiLevelType w:val="hybridMultilevel"/>
     <w:tmpl w:val="275A09B0"/>
@@ -974,7 +2666,7 @@
       </w:rPr>
     </w:lvl>
   </w:abstractNum>
-  <w:abstractNum w:abstractNumId="7" w15:restartNumberingAfterBreak="0">
+  <w:abstractNum w:abstractNumId="8" w15:restartNumberingAfterBreak="0">
     <w:nsid w:val="06E642B8"/>
     <w:multiLevelType w:val="hybridMultilevel"/>
     <w:tmpl w:val="B0EC0384"/>
@@ -1087,7 +2779,7 @@
       </w:rPr>
     </w:lvl>
   </w:abstractNum>
-  <w:abstractNum w:abstractNumId="8" w15:restartNumberingAfterBreak="0">
+  <w:abstractNum w:abstractNumId="9" w15:restartNumberingAfterBreak="0">
     <w:nsid w:val="07074833"/>
     <w:multiLevelType w:val="hybridMultilevel"/>
     <w:tmpl w:val="02EC54FC"/>
@@ -1200,7 +2892,7 @@
       </w:rPr>
     </w:lvl>
   </w:abstractNum>
-  <w:abstractNum w:abstractNumId="9" w15:restartNumberingAfterBreak="0">
+  <w:abstractNum w:abstractNumId="10" w15:restartNumberingAfterBreak="0">
     <w:nsid w:val="072E255B"/>
     <w:multiLevelType w:val="hybridMultilevel"/>
     <w:tmpl w:val="AC5E471C"/>
@@ -1313,7 +3005,7 @@
       </w:rPr>
     </w:lvl>
   </w:abstractNum>
-  <w:abstractNum w:abstractNumId="10" w15:restartNumberingAfterBreak="0">
+  <w:abstractNum w:abstractNumId="11" w15:restartNumberingAfterBreak="0">
     <w:nsid w:val="096B0076"/>
     <w:multiLevelType w:val="hybridMultilevel"/>
     <w:tmpl w:val="E0B881F8"/>
@@ -1426,7 +3118,7 @@
       </w:rPr>
     </w:lvl>
   </w:abstractNum>
-  <w:abstractNum w:abstractNumId="11" w15:restartNumberingAfterBreak="0">
+  <w:abstractNum w:abstractNumId="12" w15:restartNumberingAfterBreak="0">
     <w:nsid w:val="09861281"/>
     <w:multiLevelType w:val="hybridMultilevel"/>
     <w:tmpl w:val="46BAD708"/>
@@ -1539,7 +3231,7 @@
       </w:rPr>
     </w:lvl>
   </w:abstractNum>
-  <w:abstractNum w:abstractNumId="12" w15:restartNumberingAfterBreak="0">
+  <w:abstractNum w:abstractNumId="13" w15:restartNumberingAfterBreak="0">
     <w:nsid w:val="0B7E0010"/>
     <w:multiLevelType w:val="hybridMultilevel"/>
     <w:tmpl w:val="2DF8E270"/>
@@ -1652,7 +3344,7 @@
       </w:rPr>
     </w:lvl>
   </w:abstractNum>
-  <w:abstractNum w:abstractNumId="13" w15:restartNumberingAfterBreak="0">
+  <w:abstractNum w:abstractNumId="14" w15:restartNumberingAfterBreak="0">
     <w:nsid w:val="0BF14F52"/>
     <w:multiLevelType w:val="hybridMultilevel"/>
     <w:tmpl w:val="A62A0EF2"/>
@@ -1765,7 +3457,7 @@
       </w:rPr>
     </w:lvl>
   </w:abstractNum>
-  <w:abstractNum w:abstractNumId="14" w15:restartNumberingAfterBreak="0">
+  <w:abstractNum w:abstractNumId="15" w15:restartNumberingAfterBreak="0">
     <w:nsid w:val="0C832511"/>
     <w:multiLevelType w:val="hybridMultilevel"/>
     <w:tmpl w:val="68342666"/>
@@ -1878,7 +3570,7 @@
       </w:rPr>
     </w:lvl>
   </w:abstractNum>
-  <w:abstractNum w:abstractNumId="15" w15:restartNumberingAfterBreak="0">
+  <w:abstractNum w:abstractNumId="16" w15:restartNumberingAfterBreak="0">
     <w:nsid w:val="0DE40AD9"/>
     <w:multiLevelType w:val="hybridMultilevel"/>
     <w:tmpl w:val="A5F66F66"/>
@@ -1991,7 +3683,7 @@
       </w:rPr>
     </w:lvl>
   </w:abstractNum>
-  <w:abstractNum w:abstractNumId="16" w15:restartNumberingAfterBreak="0">
+  <w:abstractNum w:abstractNumId="17" w15:restartNumberingAfterBreak="0">
     <w:nsid w:val="0ED81B8A"/>
     <w:multiLevelType w:val="hybridMultilevel"/>
     <w:tmpl w:val="71B23CEA"/>
@@ -2104,7 +3796,7 @@
       </w:rPr>
     </w:lvl>
   </w:abstractNum>
-  <w:abstractNum w:abstractNumId="17" w15:restartNumberingAfterBreak="0">
+  <w:abstractNum w:abstractNumId="18" w15:restartNumberingAfterBreak="0">
     <w:nsid w:val="0F381745"/>
     <w:multiLevelType w:val="hybridMultilevel"/>
     <w:tmpl w:val="5756E3E0"/>
@@ -2217,7 +3909,7 @@
       </w:rPr>
     </w:lvl>
   </w:abstractNum>
-  <w:abstractNum w:abstractNumId="18" w15:restartNumberingAfterBreak="0">
+  <w:abstractNum w:abstractNumId="19" w15:restartNumberingAfterBreak="0">
     <w:nsid w:val="1034479F"/>
     <w:multiLevelType w:val="hybridMultilevel"/>
     <w:tmpl w:val="A32080CC"/>
@@ -2330,7 +4022,7 @@
       </w:rPr>
     </w:lvl>
   </w:abstractNum>
-  <w:abstractNum w:abstractNumId="19" w15:restartNumberingAfterBreak="0">
+  <w:abstractNum w:abstractNumId="20" w15:restartNumberingAfterBreak="0">
     <w:nsid w:val="10931BFA"/>
     <w:multiLevelType w:val="hybridMultilevel"/>
     <w:tmpl w:val="EB6E9E96"/>
@@ -2443,7 +4135,124 @@
       </w:rPr>
     </w:lvl>
   </w:abstractNum>
-  <w:abstractNum w:abstractNumId="20" w15:restartNumberingAfterBreak="0">
+  <w:abstractNum w:abstractNumId="21" w15:restartNumberingAfterBreak="0">
+    <w:nsid w:val="11330A14"/>
+    <w:multiLevelType w:val="multilevel"/>
+    <w:tmpl w:val="B63EF5B6"/>
+    <w:lvl w:ilvl="0">
+      <w:start w:val="5"/>
+      <w:numFmt w:val="decimal"/>
+      <w:lvlText w:val="%1."/>
+      <w:lvlJc w:val="left"/>
+      <w:pPr>
+        <w:tabs>
+          <w:tab w:val="num" w:pos="720"/>
+        </w:tabs>
+        <w:ind w:left="720" w:hanging="360"/>
+      </w:pPr>
+    </w:lvl>
+    <w:lvl w:ilvl="1">
+      <w:start w:val="1"/>
+      <w:numFmt w:val="bullet"/>
+      <w:lvlText w:val="o"/>
+      <w:lvlJc w:val="left"/>
+      <w:pPr>
+        <w:tabs>
+          <w:tab w:val="num" w:pos="1440"/>
+        </w:tabs>
+        <w:ind w:left="1440" w:hanging="360"/>
+      </w:pPr>
+      <w:rPr>
+        <w:rFonts w:ascii="Courier New" w:hAnsi="Courier New" w:hint="default"/>
+        <w:sz w:val="20"/>
+      </w:rPr>
+    </w:lvl>
+    <w:lvl w:ilvl="2" w:tentative="1">
+      <w:start w:val="1"/>
+      <w:numFmt w:val="decimal"/>
+      <w:lvlText w:val="%3."/>
+      <w:lvlJc w:val="left"/>
+      <w:pPr>
+        <w:tabs>
+          <w:tab w:val="num" w:pos="2160"/>
+        </w:tabs>
+        <w:ind w:left="2160" w:hanging="360"/>
+      </w:pPr>
+    </w:lvl>
+    <w:lvl w:ilvl="3" w:tentative="1">
+      <w:start w:val="1"/>
+      <w:numFmt w:val="decimal"/>
+      <w:lvlText w:val="%4."/>
+      <w:lvlJc w:val="left"/>
+      <w:pPr>
+        <w:tabs>
+          <w:tab w:val="num" w:pos="2880"/>
+        </w:tabs>
+        <w:ind w:left="2880" w:hanging="360"/>
+      </w:pPr>
+    </w:lvl>
+    <w:lvl w:ilvl="4" w:tentative="1">
+      <w:start w:val="1"/>
+      <w:numFmt w:val="decimal"/>
+      <w:lvlText w:val="%5."/>
+      <w:lvlJc w:val="left"/>
+      <w:pPr>
+        <w:tabs>
+          <w:tab w:val="num" w:pos="3600"/>
+        </w:tabs>
+        <w:ind w:left="3600" w:hanging="360"/>
+      </w:pPr>
+    </w:lvl>
+    <w:lvl w:ilvl="5" w:tentative="1">
+      <w:start w:val="1"/>
+      <w:numFmt w:val="decimal"/>
+      <w:lvlText w:val="%6."/>
+      <w:lvlJc w:val="left"/>
+      <w:pPr>
+        <w:tabs>
+          <w:tab w:val="num" w:pos="4320"/>
+        </w:tabs>
+        <w:ind w:left="4320" w:hanging="360"/>
+      </w:pPr>
+    </w:lvl>
+    <w:lvl w:ilvl="6" w:tentative="1">
+      <w:start w:val="1"/>
+      <w:numFmt w:val="decimal"/>
+      <w:lvlText w:val="%7."/>
+      <w:lvlJc w:val="left"/>
+      <w:pPr>
+        <w:tabs>
+          <w:tab w:val="num" w:pos="5040"/>
+        </w:tabs>
+        <w:ind w:left="5040" w:hanging="360"/>
+      </w:pPr>
+    </w:lvl>
+    <w:lvl w:ilvl="7" w:tentative="1">
+      <w:start w:val="1"/>
+      <w:numFmt w:val="decimal"/>
+      <w:lvlText w:val="%8."/>
+      <w:lvlJc w:val="left"/>
+      <w:pPr>
+        <w:tabs>
+          <w:tab w:val="num" w:pos="5760"/>
+        </w:tabs>
+        <w:ind w:left="5760" w:hanging="360"/>
+      </w:pPr>
+    </w:lvl>
+    <w:lvl w:ilvl="8" w:tentative="1">
+      <w:start w:val="1"/>
+      <w:numFmt w:val="decimal"/>
+      <w:lvlText w:val="%9."/>
+      <w:lvlJc w:val="left"/>
+      <w:pPr>
+        <w:tabs>
+          <w:tab w:val="num" w:pos="6480"/>
+        </w:tabs>
+        <w:ind w:left="6480" w:hanging="360"/>
+      </w:pPr>
+    </w:lvl>
+  </w:abstractNum>
+  <w:abstractNum w:abstractNumId="22" w15:restartNumberingAfterBreak="0">
     <w:nsid w:val="113C6911"/>
     <w:multiLevelType w:val="hybridMultilevel"/>
     <w:tmpl w:val="0596C192"/>
@@ -2556,7 +4365,120 @@
       </w:rPr>
     </w:lvl>
   </w:abstractNum>
-  <w:abstractNum w:abstractNumId="21" w15:restartNumberingAfterBreak="0">
+  <w:abstractNum w:abstractNumId="23" w15:restartNumberingAfterBreak="0">
+    <w:nsid w:val="139F6146"/>
+    <w:multiLevelType w:val="multilevel"/>
+    <w:tmpl w:val="2EB2BB9A"/>
+    <w:lvl w:ilvl="0">
+      <w:start w:val="21"/>
+      <w:numFmt w:val="decimal"/>
+      <w:lvlText w:val="%1."/>
+      <w:lvlJc w:val="left"/>
+      <w:pPr>
+        <w:tabs>
+          <w:tab w:val="num" w:pos="720"/>
+        </w:tabs>
+        <w:ind w:left="720" w:hanging="360"/>
+      </w:pPr>
+    </w:lvl>
+    <w:lvl w:ilvl="1" w:tentative="1">
+      <w:start w:val="1"/>
+      <w:numFmt w:val="decimal"/>
+      <w:lvlText w:val="%2."/>
+      <w:lvlJc w:val="left"/>
+      <w:pPr>
+        <w:tabs>
+          <w:tab w:val="num" w:pos="1440"/>
+        </w:tabs>
+        <w:ind w:left="1440" w:hanging="360"/>
+      </w:pPr>
+    </w:lvl>
+    <w:lvl w:ilvl="2" w:tentative="1">
+      <w:start w:val="1"/>
+      <w:numFmt w:val="decimal"/>
+      <w:lvlText w:val="%3."/>
+      <w:lvlJc w:val="left"/>
+      <w:pPr>
+        <w:tabs>
+          <w:tab w:val="num" w:pos="2160"/>
+        </w:tabs>
+        <w:ind w:left="2160" w:hanging="360"/>
+      </w:pPr>
+    </w:lvl>
+    <w:lvl w:ilvl="3" w:tentative="1">
+      <w:start w:val="1"/>
+      <w:numFmt w:val="decimal"/>
+      <w:lvlText w:val="%4."/>
+      <w:lvlJc w:val="left"/>
+      <w:pPr>
+        <w:tabs>
+          <w:tab w:val="num" w:pos="2880"/>
+        </w:tabs>
+        <w:ind w:left="2880" w:hanging="360"/>
+      </w:pPr>
+    </w:lvl>
+    <w:lvl w:ilvl="4" w:tentative="1">
+      <w:start w:val="1"/>
+      <w:numFmt w:val="decimal"/>
+      <w:lvlText w:val="%5."/>
+      <w:lvlJc w:val="left"/>
+      <w:pPr>
+        <w:tabs>
+          <w:tab w:val="num" w:pos="3600"/>
+        </w:tabs>
+        <w:ind w:left="3600" w:hanging="360"/>
+      </w:pPr>
+    </w:lvl>
+    <w:lvl w:ilvl="5" w:tentative="1">
+      <w:start w:val="1"/>
+      <w:numFmt w:val="decimal"/>
+      <w:lvlText w:val="%6."/>
+      <w:lvlJc w:val="left"/>
+      <w:pPr>
+        <w:tabs>
+          <w:tab w:val="num" w:pos="4320"/>
+        </w:tabs>
+        <w:ind w:left="4320" w:hanging="360"/>
+      </w:pPr>
+    </w:lvl>
+    <w:lvl w:ilvl="6" w:tentative="1">
+      <w:start w:val="1"/>
+      <w:numFmt w:val="decimal"/>
+      <w:lvlText w:val="%7."/>
+      <w:lvlJc w:val="left"/>
+      <w:pPr>
+        <w:tabs>
+          <w:tab w:val="num" w:pos="5040"/>
+        </w:tabs>
+        <w:ind w:left="5040" w:hanging="360"/>
+      </w:pPr>
+    </w:lvl>
+    <w:lvl w:ilvl="7" w:tentative="1">
+      <w:start w:val="1"/>
+      <w:numFmt w:val="decimal"/>
+      <w:lvlText w:val="%8."/>
+      <w:lvlJc w:val="left"/>
+      <w:pPr>
+        <w:tabs>
+          <w:tab w:val="num" w:pos="5760"/>
+        </w:tabs>
+        <w:ind w:left="5760" w:hanging="360"/>
+      </w:pPr>
+    </w:lvl>
+    <w:lvl w:ilvl="8" w:tentative="1">
+      <w:start w:val="1"/>
+      <w:numFmt w:val="decimal"/>
+      <w:lvlText w:val="%9."/>
+      <w:lvlJc w:val="left"/>
+      <w:pPr>
+        <w:tabs>
+          <w:tab w:val="num" w:pos="6480"/>
+        </w:tabs>
+        <w:ind w:left="6480" w:hanging="360"/>
+      </w:pPr>
+    </w:lvl>
+  </w:abstractNum>
+  <w:abstractNum w:abstractNumId="24" w15:restartNumberingAfterBreak="0">
     <w:nsid w:val="14C747DF"/>
     <w:multiLevelType w:val="hybridMultilevel"/>
     <w:tmpl w:val="FCC83812"/>
@@ -2669,7 +4591,124 @@
       </w:rPr>
     </w:lvl>
   </w:abstractNum>
-  <w:abstractNum w:abstractNumId="22" w15:restartNumberingAfterBreak="0">
+  <w:abstractNum w:abstractNumId="25" w15:restartNumberingAfterBreak="0">
+    <w:nsid w:val="15087E3B"/>
+    <w:multiLevelType w:val="multilevel"/>
+    <w:tmpl w:val="CB784208"/>
+    <w:lvl w:ilvl="0">
+      <w:start w:val="9"/>
+      <w:numFmt w:val="decimal"/>
+      <w:lvlText w:val="%1."/>
+      <w:lvlJc w:val="left"/>
+      <w:pPr>
+        <w:tabs>
+          <w:tab w:val="num" w:pos="720"/>
+        </w:tabs>
+        <w:ind w:left="720" w:hanging="360"/>
+      </w:pPr>
+    </w:lvl>
+    <w:lvl w:ilvl="1">
+      <w:start w:val="1"/>
+      <w:numFmt w:val="bullet"/>
+      <w:lvlText w:val="o"/>
+      <w:lvlJc w:val="left"/>
+      <w:pPr>
+        <w:tabs>
+          <w:tab w:val="num" w:pos="1440"/>
+        </w:tabs>
+        <w:ind w:left="1440" w:hanging="360"/>
+      </w:pPr>
+      <w:rPr>
+        <w:rFonts w:ascii="Courier New" w:hAnsi="Courier New" w:hint="default"/>
+        <w:sz w:val="20"/>
+      </w:rPr>
+    </w:lvl>
+    <w:lvl w:ilvl="2" w:tentative="1">
+      <w:start w:val="1"/>
+      <w:numFmt w:val="decimal"/>
+      <w:lvlText w:val="%3."/>
+      <w:lvlJc w:val="left"/>
+      <w:pPr>
+        <w:tabs>
+          <w:tab w:val="num" w:pos="2160"/>
+        </w:tabs>
+        <w:ind w:left="2160" w:hanging="360"/>
+      </w:pPr>
+    </w:lvl>
+    <w:lvl w:ilvl="3" w:tentative="1">
+      <w:start w:val="1"/>
+      <w:numFmt w:val="decimal"/>
+      <w:lvlText w:val="%4."/>
+      <w:lvlJc w:val="left"/>
+      <w:pPr>
+        <w:tabs>
+          <w:tab w:val="num" w:pos="2880"/>
+        </w:tabs>
+        <w:ind w:left="2880" w:hanging="360"/>
+      </w:pPr>
+    </w:lvl>
+    <w:lvl w:ilvl="4" w:tentative="1">
+      <w:start w:val="1"/>
+      <w:numFmt w:val="decimal"/>
+      <w:lvlText w:val="%5."/>
+      <w:lvlJc w:val="left"/>
+      <w:pPr>
+        <w:tabs>
+          <w:tab w:val="num" w:pos="3600"/>
+        </w:tabs>
+        <w:ind w:left="3600" w:hanging="360"/>
+      </w:pPr>
+    </w:lvl>
+    <w:lvl w:ilvl="5" w:tentative="1">
+      <w:start w:val="1"/>
+      <w:numFmt w:val="decimal"/>
+      <w:lvlText w:val="%6."/>
+      <w:lvlJc w:val="left"/>
+      <w:pPr>
+        <w:tabs>
+          <w:tab w:val="num" w:pos="4320"/>
+        </w:tabs>
+        <w:ind w:left="4320" w:hanging="360"/>
+      </w:pPr>
+    </w:lvl>
+    <w:lvl w:ilvl="6" w:tentative="1">
+      <w:start w:val="1"/>
+      <w:numFmt w:val="decimal"/>
+      <w:lvlText w:val="%7."/>
+      <w:lvlJc w:val="left"/>
+      <w:pPr>
+        <w:tabs>
+          <w:tab w:val="num" w:pos="5040"/>
+        </w:tabs>
+        <w:ind w:left="5040" w:hanging="360"/>
+      </w:pPr>
+    </w:lvl>
+    <w:lvl w:ilvl="7" w:tentative="1">
+      <w:start w:val="1"/>
+      <w:numFmt w:val="decimal"/>
+      <w:lvlText w:val="%8."/>
+      <w:lvlJc w:val="left"/>
+      <w:pPr>
+        <w:tabs>
+          <w:tab w:val="num" w:pos="5760"/>
+        </w:tabs>
+        <w:ind w:left="5760" w:hanging="360"/>
+      </w:pPr>
+    </w:lvl>
+    <w:lvl w:ilvl="8" w:tentative="1">
+      <w:start w:val="1"/>
+      <w:numFmt w:val="decimal"/>
+      <w:lvlText w:val="%9."/>
+      <w:lvlJc w:val="left"/>
+      <w:pPr>
+        <w:tabs>
+          <w:tab w:val="num" w:pos="6480"/>
+        </w:tabs>
+        <w:ind w:left="6480" w:hanging="360"/>
+      </w:pPr>
+    </w:lvl>
+  </w:abstractNum>
+  <w:abstractNum w:abstractNumId="26" w15:restartNumberingAfterBreak="0">
     <w:nsid w:val="151B6079"/>
     <w:multiLevelType w:val="hybridMultilevel"/>
     <w:tmpl w:val="8ADA4082"/>
@@ -2782,7 +4821,7 @@
       </w:rPr>
     </w:lvl>
   </w:abstractNum>
-  <w:abstractNum w:abstractNumId="23" w15:restartNumberingAfterBreak="0">
+  <w:abstractNum w:abstractNumId="27" w15:restartNumberingAfterBreak="0">
     <w:nsid w:val="15C72217"/>
     <w:multiLevelType w:val="hybridMultilevel"/>
     <w:tmpl w:val="099A9954"/>
@@ -2895,7 +4934,7 @@
       </w:rPr>
     </w:lvl>
   </w:abstractNum>
-  <w:abstractNum w:abstractNumId="24" w15:restartNumberingAfterBreak="0">
+  <w:abstractNum w:abstractNumId="28" w15:restartNumberingAfterBreak="0">
     <w:nsid w:val="169B6DC3"/>
     <w:multiLevelType w:val="hybridMultilevel"/>
     <w:tmpl w:val="34121F72"/>
@@ -3008,7 +5047,7 @@
       </w:rPr>
     </w:lvl>
   </w:abstractNum>
-  <w:abstractNum w:abstractNumId="25" w15:restartNumberingAfterBreak="0">
+  <w:abstractNum w:abstractNumId="29" w15:restartNumberingAfterBreak="0">
     <w:nsid w:val="195334CF"/>
     <w:multiLevelType w:val="hybridMultilevel"/>
     <w:tmpl w:val="47D2A496"/>
@@ -3121,7 +5160,7 @@
       </w:rPr>
     </w:lvl>
   </w:abstractNum>
-  <w:abstractNum w:abstractNumId="26" w15:restartNumberingAfterBreak="0">
+  <w:abstractNum w:abstractNumId="30" w15:restartNumberingAfterBreak="0">
     <w:nsid w:val="1B9F6A20"/>
     <w:multiLevelType w:val="hybridMultilevel"/>
     <w:tmpl w:val="159435C0"/>
@@ -3234,7 +5273,7 @@
       </w:rPr>
     </w:lvl>
   </w:abstractNum>
-  <w:abstractNum w:abstractNumId="27" w15:restartNumberingAfterBreak="0">
+  <w:abstractNum w:abstractNumId="31" w15:restartNumberingAfterBreak="0">
     <w:nsid w:val="1D045ABD"/>
     <w:multiLevelType w:val="hybridMultilevel"/>
     <w:tmpl w:val="76DA16E6"/>
@@ -3347,7 +5386,7 @@
       </w:rPr>
     </w:lvl>
   </w:abstractNum>
-  <w:abstractNum w:abstractNumId="28" w15:restartNumberingAfterBreak="0">
+  <w:abstractNum w:abstractNumId="32" w15:restartNumberingAfterBreak="0">
     <w:nsid w:val="1D810F26"/>
     <w:multiLevelType w:val="hybridMultilevel"/>
     <w:tmpl w:val="A4CA6CD2"/>
@@ -3460,7 +5499,7 @@
       </w:rPr>
     </w:lvl>
   </w:abstractNum>
-  <w:abstractNum w:abstractNumId="29" w15:restartNumberingAfterBreak="0">
+  <w:abstractNum w:abstractNumId="33" w15:restartNumberingAfterBreak="0">
     <w:nsid w:val="1EF72CB2"/>
     <w:multiLevelType w:val="hybridMultilevel"/>
     <w:tmpl w:val="DEA62A28"/>
@@ -3573,7 +5612,7 @@
       </w:rPr>
     </w:lvl>
   </w:abstractNum>
-  <w:abstractNum w:abstractNumId="30" w15:restartNumberingAfterBreak="0">
+  <w:abstractNum w:abstractNumId="34" w15:restartNumberingAfterBreak="0">
     <w:nsid w:val="1F9B463C"/>
     <w:multiLevelType w:val="hybridMultilevel"/>
     <w:tmpl w:val="4D229200"/>
@@ -3686,7 +5725,7 @@
       </w:rPr>
     </w:lvl>
   </w:abstractNum>
-  <w:abstractNum w:abstractNumId="31" w15:restartNumberingAfterBreak="0">
+  <w:abstractNum w:abstractNumId="35" w15:restartNumberingAfterBreak="0">
     <w:nsid w:val="202269C3"/>
     <w:multiLevelType w:val="hybridMultilevel"/>
     <w:tmpl w:val="37448484"/>
@@ -3799,7 +5838,7 @@
       </w:rPr>
     </w:lvl>
   </w:abstractNum>
-  <w:abstractNum w:abstractNumId="32" w15:restartNumberingAfterBreak="0">
+  <w:abstractNum w:abstractNumId="36" w15:restartNumberingAfterBreak="0">
     <w:nsid w:val="20D07DB6"/>
     <w:multiLevelType w:val="hybridMultilevel"/>
     <w:tmpl w:val="0A56003E"/>
@@ -3912,7 +5951,7 @@
       </w:rPr>
     </w:lvl>
   </w:abstractNum>
-  <w:abstractNum w:abstractNumId="33" w15:restartNumberingAfterBreak="0">
+  <w:abstractNum w:abstractNumId="37" w15:restartNumberingAfterBreak="0">
     <w:nsid w:val="21557B09"/>
     <w:multiLevelType w:val="hybridMultilevel"/>
     <w:tmpl w:val="D22A1936"/>
@@ -4025,7 +6064,7 @@
       </w:rPr>
     </w:lvl>
   </w:abstractNum>
-  <w:abstractNum w:abstractNumId="34" w15:restartNumberingAfterBreak="0">
+  <w:abstractNum w:abstractNumId="38" w15:restartNumberingAfterBreak="0">
     <w:nsid w:val="240C21B5"/>
     <w:multiLevelType w:val="hybridMultilevel"/>
     <w:tmpl w:val="8F4E4248"/>
@@ -4138,7 +6177,7 @@
       </w:rPr>
     </w:lvl>
   </w:abstractNum>
-  <w:abstractNum w:abstractNumId="35" w15:restartNumberingAfterBreak="0">
+  <w:abstractNum w:abstractNumId="39" w15:restartNumberingAfterBreak="0">
     <w:nsid w:val="254C0D33"/>
     <w:multiLevelType w:val="hybridMultilevel"/>
     <w:tmpl w:val="12A2245A"/>
@@ -4251,7 +6290,124 @@
       </w:rPr>
     </w:lvl>
   </w:abstractNum>
-  <w:abstractNum w:abstractNumId="36" w15:restartNumberingAfterBreak="0">
+  <w:abstractNum w:abstractNumId="40" w15:restartNumberingAfterBreak="0">
+    <w:nsid w:val="25C06892"/>
+    <w:multiLevelType w:val="multilevel"/>
+    <w:tmpl w:val="CCBCF100"/>
+    <w:lvl w:ilvl="0">
+      <w:start w:val="12"/>
+      <w:numFmt w:val="decimal"/>
+      <w:lvlText w:val="%1."/>
+      <w:lvlJc w:val="left"/>
+      <w:pPr>
+        <w:tabs>
+          <w:tab w:val="num" w:pos="720"/>
+        </w:tabs>
+        <w:ind w:left="720" w:hanging="360"/>
+      </w:pPr>
+    </w:lvl>
+    <w:lvl w:ilvl="1">
+      <w:start w:val="1"/>
+      <w:numFmt w:val="bullet"/>
+      <w:lvlText w:val="o"/>
+      <w:lvlJc w:val="left"/>
+      <w:pPr>
+        <w:tabs>
+          <w:tab w:val="num" w:pos="1440"/>
+        </w:tabs>
+        <w:ind w:left="1440" w:hanging="360"/>
+      </w:pPr>
+      <w:rPr>
+        <w:rFonts w:ascii="Courier New" w:hAnsi="Courier New" w:hint="default"/>
+        <w:sz w:val="20"/>
+      </w:rPr>
+    </w:lvl>
+    <w:lvl w:ilvl="2" w:tentative="1">
+      <w:start w:val="1"/>
+      <w:numFmt w:val="decimal"/>
+      <w:lvlText w:val="%3."/>
+      <w:lvlJc w:val="left"/>
+      <w:pPr>
+        <w:tabs>
+          <w:tab w:val="num" w:pos="2160"/>
+        </w:tabs>
+        <w:ind w:left="2160" w:hanging="360"/>
+      </w:pPr>
+    </w:lvl>
+    <w:lvl w:ilvl="3" w:tentative="1">
+      <w:start w:val="1"/>
+      <w:numFmt w:val="decimal"/>
+      <w:lvlText w:val="%4."/>
+      <w:lvlJc w:val="left"/>
+      <w:pPr>
+        <w:tabs>
+          <w:tab w:val="num" w:pos="2880"/>
+        </w:tabs>
+        <w:ind w:left="2880" w:hanging="360"/>
+      </w:pPr>
+    </w:lvl>
+    <w:lvl w:ilvl="4" w:tentative="1">
+      <w:start w:val="1"/>
+      <w:numFmt w:val="decimal"/>
+      <w:lvlText w:val="%5."/>
+      <w:lvlJc w:val="left"/>
+      <w:pPr>
+        <w:tabs>
+          <w:tab w:val="num" w:pos="3600"/>
+        </w:tabs>
+        <w:ind w:left="3600" w:hanging="360"/>
+      </w:pPr>
+    </w:lvl>
+    <w:lvl w:ilvl="5" w:tentative="1">
+      <w:start w:val="1"/>
+      <w:numFmt w:val="decimal"/>
+      <w:lvlText w:val="%6."/>
+      <w:lvlJc w:val="left"/>
+      <w:pPr>
+        <w:tabs>
+          <w:tab w:val="num" w:pos="4320"/>
+        </w:tabs>
+        <w:ind w:left="4320" w:hanging="360"/>
+      </w:pPr>
+    </w:lvl>
+    <w:lvl w:ilvl="6" w:tentative="1">
+      <w:start w:val="1"/>
+      <w:numFmt w:val="decimal"/>
+      <w:lvlText w:val="%7."/>
+      <w:lvlJc w:val="left"/>
+      <w:pPr>
+        <w:tabs>
+          <w:tab w:val="num" w:pos="5040"/>
+        </w:tabs>
+        <w:ind w:left="5040" w:hanging="360"/>
+      </w:pPr>
+    </w:lvl>
+    <w:lvl w:ilvl="7" w:tentative="1">
+      <w:start w:val="1"/>
+      <w:numFmt w:val="decimal"/>
+      <w:lvlText w:val="%8."/>
+      <w:lvlJc w:val="left"/>
+      <w:pPr>
+        <w:tabs>
+          <w:tab w:val="num" w:pos="5760"/>
+        </w:tabs>
+        <w:ind w:left="5760" w:hanging="360"/>
+      </w:pPr>
+    </w:lvl>
+    <w:lvl w:ilvl="8" w:tentative="1">
+      <w:start w:val="1"/>
+      <w:numFmt w:val="decimal"/>
+      <w:lvlText w:val="%9."/>
+      <w:lvlJc w:val="left"/>
+      <w:pPr>
+        <w:tabs>
+          <w:tab w:val="num" w:pos="6480"/>
+        </w:tabs>
+        <w:ind w:left="6480" w:hanging="360"/>
+      </w:pPr>
+    </w:lvl>
+  </w:abstractNum>
+  <w:abstractNum w:abstractNumId="41" w15:restartNumberingAfterBreak="0">
     <w:nsid w:val="27A17E83"/>
     <w:multiLevelType w:val="hybridMultilevel"/>
     <w:tmpl w:val="6310D1CE"/>
@@ -4364,7 +6520,7 @@
       </w:rPr>
     </w:lvl>
   </w:abstractNum>
-  <w:abstractNum w:abstractNumId="37" w15:restartNumberingAfterBreak="0">
+  <w:abstractNum w:abstractNumId="42" w15:restartNumberingAfterBreak="0">
     <w:nsid w:val="28BB5ADF"/>
     <w:multiLevelType w:val="hybridMultilevel"/>
     <w:tmpl w:val="CF4E5F4A"/>
@@ -4477,7 +6633,7 @@
       </w:rPr>
     </w:lvl>
   </w:abstractNum>
-  <w:abstractNum w:abstractNumId="38" w15:restartNumberingAfterBreak="0">
+  <w:abstractNum w:abstractNumId="43" w15:restartNumberingAfterBreak="0">
     <w:nsid w:val="29567AC9"/>
     <w:multiLevelType w:val="hybridMultilevel"/>
     <w:tmpl w:val="9516FC8E"/>
@@ -4590,7 +6746,7 @@
       </w:rPr>
     </w:lvl>
   </w:abstractNum>
-  <w:abstractNum w:abstractNumId="39" w15:restartNumberingAfterBreak="0">
+  <w:abstractNum w:abstractNumId="44" w15:restartNumberingAfterBreak="0">
     <w:nsid w:val="29722AF9"/>
     <w:multiLevelType w:val="hybridMultilevel"/>
     <w:tmpl w:val="A16401DC"/>
@@ -4703,7 +6859,7 @@
       </w:rPr>
     </w:lvl>
   </w:abstractNum>
-  <w:abstractNum w:abstractNumId="40" w15:restartNumberingAfterBreak="0">
+  <w:abstractNum w:abstractNumId="45" w15:restartNumberingAfterBreak="0">
     <w:nsid w:val="2A972F4B"/>
     <w:multiLevelType w:val="hybridMultilevel"/>
     <w:tmpl w:val="137CBA88"/>
@@ -4816,7 +6972,7 @@
       </w:rPr>
     </w:lvl>
   </w:abstractNum>
-  <w:abstractNum w:abstractNumId="41" w15:restartNumberingAfterBreak="0">
+  <w:abstractNum w:abstractNumId="46" w15:restartNumberingAfterBreak="0">
     <w:nsid w:val="2DE31ECD"/>
     <w:multiLevelType w:val="hybridMultilevel"/>
     <w:tmpl w:val="BAE45DAE"/>
@@ -4929,7 +7085,7 @@
       </w:rPr>
     </w:lvl>
   </w:abstractNum>
-  <w:abstractNum w:abstractNumId="42" w15:restartNumberingAfterBreak="0">
+  <w:abstractNum w:abstractNumId="47" w15:restartNumberingAfterBreak="0">
     <w:nsid w:val="2E360F42"/>
     <w:multiLevelType w:val="hybridMultilevel"/>
     <w:tmpl w:val="12E420BE"/>
@@ -5042,7 +7198,7 @@
       </w:rPr>
     </w:lvl>
   </w:abstractNum>
-  <w:abstractNum w:abstractNumId="43" w15:restartNumberingAfterBreak="0">
+  <w:abstractNum w:abstractNumId="48" w15:restartNumberingAfterBreak="0">
     <w:nsid w:val="30666462"/>
     <w:multiLevelType w:val="hybridMultilevel"/>
     <w:tmpl w:val="A5901EC2"/>
@@ -5155,7 +7311,7 @@
       </w:rPr>
     </w:lvl>
   </w:abstractNum>
-  <w:abstractNum w:abstractNumId="44" w15:restartNumberingAfterBreak="0">
+  <w:abstractNum w:abstractNumId="49" w15:restartNumberingAfterBreak="0">
     <w:nsid w:val="31802F19"/>
     <w:multiLevelType w:val="hybridMultilevel"/>
     <w:tmpl w:val="01BE37DE"/>
@@ -5268,7 +7424,7 @@
       </w:rPr>
     </w:lvl>
   </w:abstractNum>
-  <w:abstractNum w:abstractNumId="45" w15:restartNumberingAfterBreak="0">
+  <w:abstractNum w:abstractNumId="50" w15:restartNumberingAfterBreak="0">
     <w:nsid w:val="334F2005"/>
     <w:multiLevelType w:val="hybridMultilevel"/>
     <w:tmpl w:val="29587C9E"/>
@@ -5381,7 +7537,7 @@
       </w:rPr>
     </w:lvl>
   </w:abstractNum>
-  <w:abstractNum w:abstractNumId="46" w15:restartNumberingAfterBreak="0">
+  <w:abstractNum w:abstractNumId="51" w15:restartNumberingAfterBreak="0">
     <w:nsid w:val="37B6769D"/>
     <w:multiLevelType w:val="hybridMultilevel"/>
     <w:tmpl w:val="82DE22CC"/>
@@ -5494,7 +7650,124 @@
       </w:rPr>
     </w:lvl>
   </w:abstractNum>
-  <w:abstractNum w:abstractNumId="47" w15:restartNumberingAfterBreak="0">
+  <w:abstractNum w:abstractNumId="52" w15:restartNumberingAfterBreak="0">
+    <w:nsid w:val="38834B6F"/>
+    <w:multiLevelType w:val="multilevel"/>
+    <w:tmpl w:val="4CD621FA"/>
+    <w:lvl w:ilvl="0">
+      <w:start w:val="1"/>
+      <w:numFmt w:val="decimal"/>
+      <w:lvlText w:val="%1."/>
+      <w:lvlJc w:val="left"/>
+      <w:pPr>
+        <w:tabs>
+          <w:tab w:val="num" w:pos="720"/>
+        </w:tabs>
+        <w:ind w:left="720" w:hanging="360"/>
+      </w:pPr>
+    </w:lvl>
+    <w:lvl w:ilvl="1">
+      <w:start w:val="1"/>
+      <w:numFmt w:val="bullet"/>
+      <w:lvlText w:val="o"/>
+      <w:lvlJc w:val="left"/>
+      <w:pPr>
+        <w:tabs>
+          <w:tab w:val="num" w:pos="1440"/>
+        </w:tabs>
+        <w:ind w:left="1440" w:hanging="360"/>
+      </w:pPr>
+      <w:rPr>
+        <w:rFonts w:ascii="Courier New" w:hAnsi="Courier New" w:hint="default"/>
+        <w:sz w:val="20"/>
+      </w:rPr>
+    </w:lvl>
+    <w:lvl w:ilvl="2" w:tentative="1">
+      <w:start w:val="1"/>
+      <w:numFmt w:val="decimal"/>
+      <w:lvlText w:val="%3."/>
+      <w:lvlJc w:val="left"/>
+      <w:pPr>
+        <w:tabs>
+          <w:tab w:val="num" w:pos="2160"/>
+        </w:tabs>
+        <w:ind w:left="2160" w:hanging="360"/>
+      </w:pPr>
+    </w:lvl>
+    <w:lvl w:ilvl="3" w:tentative="1">
+      <w:start w:val="1"/>
+      <w:numFmt w:val="decimal"/>
+      <w:lvlText w:val="%4."/>
+      <w:lvlJc w:val="left"/>
+      <w:pPr>
+        <w:tabs>
+          <w:tab w:val="num" w:pos="2880"/>
+        </w:tabs>
+        <w:ind w:left="2880" w:hanging="360"/>
+      </w:pPr>
+    </w:lvl>
+    <w:lvl w:ilvl="4" w:tentative="1">
+      <w:start w:val="1"/>
+      <w:numFmt w:val="decimal"/>
+      <w:lvlText w:val="%5."/>
+      <w:lvlJc w:val="left"/>
+      <w:pPr>
+        <w:tabs>
+          <w:tab w:val="num" w:pos="3600"/>
+        </w:tabs>
+        <w:ind w:left="3600" w:hanging="360"/>
+      </w:pPr>
+    </w:lvl>
+    <w:lvl w:ilvl="5" w:tentative="1">
+      <w:start w:val="1"/>
+      <w:numFmt w:val="decimal"/>
+      <w:lvlText w:val="%6."/>
+      <w:lvlJc w:val="left"/>
+      <w:pPr>
+        <w:tabs>
+          <w:tab w:val="num" w:pos="4320"/>
+        </w:tabs>
+        <w:ind w:left="4320" w:hanging="360"/>
+      </w:pPr>
+    </w:lvl>
+    <w:lvl w:ilvl="6" w:tentative="1">
+      <w:start w:val="1"/>
+      <w:numFmt w:val="decimal"/>
+      <w:lvlText w:val="%7."/>
+      <w:lvlJc w:val="left"/>
+      <w:pPr>
+        <w:tabs>
+          <w:tab w:val="num" w:pos="5040"/>
+        </w:tabs>
+        <w:ind w:left="5040" w:hanging="360"/>
+      </w:pPr>
+    </w:lvl>
+    <w:lvl w:ilvl="7" w:tentative="1">
+      <w:start w:val="1"/>
+      <w:numFmt w:val="decimal"/>
+      <w:lvlText w:val="%8."/>
+      <w:lvlJc w:val="left"/>
+      <w:pPr>
+        <w:tabs>
+          <w:tab w:val="num" w:pos="5760"/>
+        </w:tabs>
+        <w:ind w:left="5760" w:hanging="360"/>
+      </w:pPr>
+    </w:lvl>
+    <w:lvl w:ilvl="8" w:tentative="1">
+      <w:start w:val="1"/>
+      <w:numFmt w:val="decimal"/>
+      <w:lvlText w:val="%9."/>
+      <w:lvlJc w:val="left"/>
+      <w:pPr>
+        <w:tabs>
+          <w:tab w:val="num" w:pos="6480"/>
+        </w:tabs>
+        <w:ind w:left="6480" w:hanging="360"/>
+      </w:pPr>
+    </w:lvl>
+  </w:abstractNum>
+  <w:abstractNum w:abstractNumId="53" w15:restartNumberingAfterBreak="0">
     <w:nsid w:val="39301732"/>
     <w:multiLevelType w:val="hybridMultilevel"/>
     <w:tmpl w:val="084EEE40"/>
@@ -5607,7 +7880,7 @@
       </w:rPr>
     </w:lvl>
   </w:abstractNum>
-  <w:abstractNum w:abstractNumId="48" w15:restartNumberingAfterBreak="0">
+  <w:abstractNum w:abstractNumId="54" w15:restartNumberingAfterBreak="0">
     <w:nsid w:val="3B712B55"/>
     <w:multiLevelType w:val="hybridMultilevel"/>
     <w:tmpl w:val="2CD2D092"/>
@@ -5720,7 +7993,7 @@
       </w:rPr>
     </w:lvl>
   </w:abstractNum>
-  <w:abstractNum w:abstractNumId="49" w15:restartNumberingAfterBreak="0">
+  <w:abstractNum w:abstractNumId="55" w15:restartNumberingAfterBreak="0">
     <w:nsid w:val="3D5B0BF0"/>
     <w:multiLevelType w:val="hybridMultilevel"/>
     <w:tmpl w:val="65CA55E4"/>
@@ -5833,7 +8106,7 @@
       </w:rPr>
     </w:lvl>
   </w:abstractNum>
-  <w:abstractNum w:abstractNumId="50" w15:restartNumberingAfterBreak="0">
+  <w:abstractNum w:abstractNumId="56" w15:restartNumberingAfterBreak="0">
     <w:nsid w:val="3FBE1CD3"/>
     <w:multiLevelType w:val="hybridMultilevel"/>
     <w:tmpl w:val="0BDA0824"/>
@@ -5946,7 +8219,7 @@
       </w:rPr>
     </w:lvl>
   </w:abstractNum>
-  <w:abstractNum w:abstractNumId="51" w15:restartNumberingAfterBreak="0">
+  <w:abstractNum w:abstractNumId="57" w15:restartNumberingAfterBreak="0">
     <w:nsid w:val="3FDF024A"/>
     <w:multiLevelType w:val="hybridMultilevel"/>
     <w:tmpl w:val="0B82C176"/>
@@ -6059,7 +8332,7 @@
       </w:rPr>
     </w:lvl>
   </w:abstractNum>
-  <w:abstractNum w:abstractNumId="52" w15:restartNumberingAfterBreak="0">
+  <w:abstractNum w:abstractNumId="58" w15:restartNumberingAfterBreak="0">
     <w:nsid w:val="42197E35"/>
     <w:multiLevelType w:val="hybridMultilevel"/>
     <w:tmpl w:val="2E8AEBE4"/>
@@ -6172,7 +8445,7 @@
       </w:rPr>
     </w:lvl>
   </w:abstractNum>
-  <w:abstractNum w:abstractNumId="53" w15:restartNumberingAfterBreak="0">
+  <w:abstractNum w:abstractNumId="59" w15:restartNumberingAfterBreak="0">
     <w:nsid w:val="448A2456"/>
     <w:multiLevelType w:val="hybridMultilevel"/>
     <w:tmpl w:val="3CF4D8D2"/>
@@ -6285,7 +8558,7 @@
       </w:rPr>
     </w:lvl>
   </w:abstractNum>
-  <w:abstractNum w:abstractNumId="54" w15:restartNumberingAfterBreak="0">
+  <w:abstractNum w:abstractNumId="60" w15:restartNumberingAfterBreak="0">
     <w:nsid w:val="459811D6"/>
     <w:multiLevelType w:val="hybridMultilevel"/>
     <w:tmpl w:val="F11660DE"/>
@@ -6398,7 +8671,7 @@
       </w:rPr>
     </w:lvl>
   </w:abstractNum>
-  <w:abstractNum w:abstractNumId="55" w15:restartNumberingAfterBreak="0">
+  <w:abstractNum w:abstractNumId="61" w15:restartNumberingAfterBreak="0">
     <w:nsid w:val="46920224"/>
     <w:multiLevelType w:val="hybridMultilevel"/>
     <w:tmpl w:val="AAB2D950"/>
@@ -6511,7 +8784,7 @@
       </w:rPr>
     </w:lvl>
   </w:abstractNum>
-  <w:abstractNum w:abstractNumId="56" w15:restartNumberingAfterBreak="0">
+  <w:abstractNum w:abstractNumId="62" w15:restartNumberingAfterBreak="0">
     <w:nsid w:val="46D35B33"/>
     <w:multiLevelType w:val="hybridMultilevel"/>
     <w:tmpl w:val="F4B0B496"/>
@@ -6624,7 +8897,7 @@
       </w:rPr>
     </w:lvl>
   </w:abstractNum>
-  <w:abstractNum w:abstractNumId="57" w15:restartNumberingAfterBreak="0">
+  <w:abstractNum w:abstractNumId="63" w15:restartNumberingAfterBreak="0">
     <w:nsid w:val="478A3A95"/>
     <w:multiLevelType w:val="hybridMultilevel"/>
     <w:tmpl w:val="3A869B56"/>
@@ -6737,7 +9010,7 @@
       </w:rPr>
     </w:lvl>
   </w:abstractNum>
-  <w:abstractNum w:abstractNumId="58" w15:restartNumberingAfterBreak="0">
+  <w:abstractNum w:abstractNumId="64" w15:restartNumberingAfterBreak="0">
     <w:nsid w:val="49255A3C"/>
     <w:multiLevelType w:val="hybridMultilevel"/>
     <w:tmpl w:val="07E2C82E"/>
@@ -6850,7 +9123,7 @@
       </w:rPr>
     </w:lvl>
   </w:abstractNum>
-  <w:abstractNum w:abstractNumId="59" w15:restartNumberingAfterBreak="0">
+  <w:abstractNum w:abstractNumId="65" w15:restartNumberingAfterBreak="0">
     <w:nsid w:val="4BB11B69"/>
     <w:multiLevelType w:val="hybridMultilevel"/>
     <w:tmpl w:val="75F47FB8"/>
@@ -6963,7 +9236,7 @@
       </w:rPr>
     </w:lvl>
   </w:abstractNum>
-  <w:abstractNum w:abstractNumId="60" w15:restartNumberingAfterBreak="0">
+  <w:abstractNum w:abstractNumId="66" w15:restartNumberingAfterBreak="0">
     <w:nsid w:val="4C9E0780"/>
     <w:multiLevelType w:val="hybridMultilevel"/>
     <w:tmpl w:val="D23A9754"/>
@@ -7076,7 +9349,7 @@
       </w:rPr>
     </w:lvl>
   </w:abstractNum>
-  <w:abstractNum w:abstractNumId="61" w15:restartNumberingAfterBreak="0">
+  <w:abstractNum w:abstractNumId="67" w15:restartNumberingAfterBreak="0">
     <w:nsid w:val="4D35312B"/>
     <w:multiLevelType w:val="hybridMultilevel"/>
     <w:tmpl w:val="0B562FE6"/>
@@ -7189,7 +9462,120 @@
       </w:rPr>
     </w:lvl>
   </w:abstractNum>
-  <w:abstractNum w:abstractNumId="62" w15:restartNumberingAfterBreak="0">
+  <w:abstractNum w:abstractNumId="68" w15:restartNumberingAfterBreak="0">
+    <w:nsid w:val="4DAB5A56"/>
+    <w:multiLevelType w:val="multilevel"/>
+    <w:tmpl w:val="C94C1452"/>
+    <w:lvl w:ilvl="0">
+      <w:start w:val="15"/>
+      <w:numFmt w:val="decimal"/>
+      <w:lvlText w:val="%1."/>
+      <w:lvlJc w:val="left"/>
+      <w:pPr>
+        <w:tabs>
+          <w:tab w:val="num" w:pos="720"/>
+        </w:tabs>
+        <w:ind w:left="720" w:hanging="360"/>
+      </w:pPr>
+    </w:lvl>
+    <w:lvl w:ilvl="1" w:tentative="1">
+      <w:start w:val="1"/>
+      <w:numFmt w:val="decimal"/>
+      <w:lvlText w:val="%2."/>
+      <w:lvlJc w:val="left"/>
+      <w:pPr>
+        <w:tabs>
+          <w:tab w:val="num" w:pos="1440"/>
+        </w:tabs>
+        <w:ind w:left="1440" w:hanging="360"/>
+      </w:pPr>
+    </w:lvl>
+    <w:lvl w:ilvl="2" w:tentative="1">
+      <w:start w:val="1"/>
+      <w:numFmt w:val="decimal"/>
+      <w:lvlText w:val="%3."/>
+      <w:lvlJc w:val="left"/>
+      <w:pPr>
+        <w:tabs>
+          <w:tab w:val="num" w:pos="2160"/>
+        </w:tabs>
+        <w:ind w:left="2160" w:hanging="360"/>
+      </w:pPr>
+    </w:lvl>
+    <w:lvl w:ilvl="3" w:tentative="1">
+      <w:start w:val="1"/>
+      <w:numFmt w:val="decimal"/>
+      <w:lvlText w:val="%4."/>
+      <w:lvlJc w:val="left"/>
+      <w:pPr>
+        <w:tabs>
+          <w:tab w:val="num" w:pos="2880"/>
+        </w:tabs>
+        <w:ind w:left="2880" w:hanging="360"/>
+      </w:pPr>
+    </w:lvl>
+    <w:lvl w:ilvl="4" w:tentative="1">
+      <w:start w:val="1"/>
+      <w:numFmt w:val="decimal"/>
+      <w:lvlText w:val="%5."/>
+      <w:lvlJc w:val="left"/>
+      <w:pPr>
+        <w:tabs>
+          <w:tab w:val="num" w:pos="3600"/>
+        </w:tabs>
+        <w:ind w:left="3600" w:hanging="360"/>
+      </w:pPr>
+    </w:lvl>
+    <w:lvl w:ilvl="5" w:tentative="1">
+      <w:start w:val="1"/>
+      <w:numFmt w:val="decimal"/>
+      <w:lvlText w:val="%6."/>
+      <w:lvlJc w:val="left"/>
+      <w:pPr>
+        <w:tabs>
+          <w:tab w:val="num" w:pos="4320"/>
+        </w:tabs>
+        <w:ind w:left="4320" w:hanging="360"/>
+      </w:pPr>
+    </w:lvl>
+    <w:lvl w:ilvl="6" w:tentative="1">
+      <w:start w:val="1"/>
+      <w:numFmt w:val="decimal"/>
+      <w:lvlText w:val="%7."/>
+      <w:lvlJc w:val="left"/>
+      <w:pPr>
+        <w:tabs>
+          <w:tab w:val="num" w:pos="5040"/>
+        </w:tabs>
+        <w:ind w:left="5040" w:hanging="360"/>
+      </w:pPr>
+    </w:lvl>
+    <w:lvl w:ilvl="7" w:tentative="1">
+      <w:start w:val="1"/>
+      <w:numFmt w:val="decimal"/>
+      <w:lvlText w:val="%8."/>
+      <w:lvlJc w:val="left"/>
+      <w:pPr>
+        <w:tabs>
+          <w:tab w:val="num" w:pos="5760"/>
+        </w:tabs>
+        <w:ind w:left="5760" w:hanging="360"/>
+      </w:pPr>
+    </w:lvl>
+    <w:lvl w:ilvl="8" w:tentative="1">
+      <w:start w:val="1"/>
+      <w:numFmt w:val="decimal"/>
+      <w:lvlText w:val="%9."/>
+      <w:lvlJc w:val="left"/>
+      <w:pPr>
+        <w:tabs>
+          <w:tab w:val="num" w:pos="6480"/>
+        </w:tabs>
+        <w:ind w:left="6480" w:hanging="360"/>
+      </w:pPr>
+    </w:lvl>
+  </w:abstractNum>
+  <w:abstractNum w:abstractNumId="69" w15:restartNumberingAfterBreak="0">
     <w:nsid w:val="4DFB5CDB"/>
     <w:multiLevelType w:val="hybridMultilevel"/>
     <w:tmpl w:val="1D50EB74"/>
@@ -7302,7 +9688,7 @@
       </w:rPr>
     </w:lvl>
   </w:abstractNum>
-  <w:abstractNum w:abstractNumId="63" w15:restartNumberingAfterBreak="0">
+  <w:abstractNum w:abstractNumId="70" w15:restartNumberingAfterBreak="0">
     <w:nsid w:val="4E8C1A33"/>
     <w:multiLevelType w:val="hybridMultilevel"/>
     <w:tmpl w:val="8AFA1F48"/>
@@ -7415,7 +9801,7 @@
       </w:rPr>
     </w:lvl>
   </w:abstractNum>
-  <w:abstractNum w:abstractNumId="64" w15:restartNumberingAfterBreak="0">
+  <w:abstractNum w:abstractNumId="71" w15:restartNumberingAfterBreak="0">
     <w:nsid w:val="53313E9C"/>
     <w:multiLevelType w:val="hybridMultilevel"/>
     <w:tmpl w:val="5E2C4702"/>
@@ -7528,7 +9914,7 @@
       </w:rPr>
     </w:lvl>
   </w:abstractNum>
-  <w:abstractNum w:abstractNumId="65" w15:restartNumberingAfterBreak="0">
+  <w:abstractNum w:abstractNumId="72" w15:restartNumberingAfterBreak="0">
     <w:nsid w:val="536F0BBE"/>
     <w:multiLevelType w:val="hybridMultilevel"/>
     <w:tmpl w:val="32984DD6"/>
@@ -7641,7 +10027,7 @@
       </w:rPr>
     </w:lvl>
   </w:abstractNum>
-  <w:abstractNum w:abstractNumId="66" w15:restartNumberingAfterBreak="0">
+  <w:abstractNum w:abstractNumId="73" w15:restartNumberingAfterBreak="0">
     <w:nsid w:val="53EC45B5"/>
     <w:multiLevelType w:val="hybridMultilevel"/>
     <w:tmpl w:val="F28A2C94"/>
@@ -7754,7 +10140,7 @@
       </w:rPr>
     </w:lvl>
   </w:abstractNum>
-  <w:abstractNum w:abstractNumId="67" w15:restartNumberingAfterBreak="0">
+  <w:abstractNum w:abstractNumId="74" w15:restartNumberingAfterBreak="0">
     <w:nsid w:val="55444A64"/>
     <w:multiLevelType w:val="hybridMultilevel"/>
     <w:tmpl w:val="6B7A9CA2"/>
@@ -7867,7 +10253,7 @@
       </w:rPr>
     </w:lvl>
   </w:abstractNum>
-  <w:abstractNum w:abstractNumId="68" w15:restartNumberingAfterBreak="0">
+  <w:abstractNum w:abstractNumId="75" w15:restartNumberingAfterBreak="0">
     <w:nsid w:val="55567C96"/>
     <w:multiLevelType w:val="hybridMultilevel"/>
     <w:tmpl w:val="D6344098"/>
@@ -7980,7 +10366,7 @@
       </w:rPr>
     </w:lvl>
   </w:abstractNum>
-  <w:abstractNum w:abstractNumId="69" w15:restartNumberingAfterBreak="0">
+  <w:abstractNum w:abstractNumId="76" w15:restartNumberingAfterBreak="0">
     <w:nsid w:val="55782BDA"/>
     <w:multiLevelType w:val="hybridMultilevel"/>
     <w:tmpl w:val="287ED540"/>
@@ -8093,7 +10479,7 @@
       </w:rPr>
     </w:lvl>
   </w:abstractNum>
-  <w:abstractNum w:abstractNumId="70" w15:restartNumberingAfterBreak="0">
+  <w:abstractNum w:abstractNumId="77" w15:restartNumberingAfterBreak="0">
     <w:nsid w:val="55816C02"/>
     <w:multiLevelType w:val="hybridMultilevel"/>
     <w:tmpl w:val="9998FCDA"/>
@@ -8206,7 +10592,7 @@
       </w:rPr>
     </w:lvl>
   </w:abstractNum>
-  <w:abstractNum w:abstractNumId="71" w15:restartNumberingAfterBreak="0">
+  <w:abstractNum w:abstractNumId="78" w15:restartNumberingAfterBreak="0">
     <w:nsid w:val="56844090"/>
     <w:multiLevelType w:val="hybridMultilevel"/>
     <w:tmpl w:val="45566C94"/>
@@ -8319,7 +10705,7 @@
       </w:rPr>
     </w:lvl>
   </w:abstractNum>
-  <w:abstractNum w:abstractNumId="72" w15:restartNumberingAfterBreak="0">
+  <w:abstractNum w:abstractNumId="79" w15:restartNumberingAfterBreak="0">
     <w:nsid w:val="59625296"/>
     <w:multiLevelType w:val="hybridMultilevel"/>
     <w:tmpl w:val="026C602C"/>
@@ -8432,7 +10818,7 @@
       </w:rPr>
     </w:lvl>
   </w:abstractNum>
-  <w:abstractNum w:abstractNumId="73" w15:restartNumberingAfterBreak="0">
+  <w:abstractNum w:abstractNumId="80" w15:restartNumberingAfterBreak="0">
     <w:nsid w:val="59B07E24"/>
     <w:multiLevelType w:val="hybridMultilevel"/>
     <w:tmpl w:val="F8CC2FBA"/>
@@ -8545,7 +10931,120 @@
       </w:rPr>
     </w:lvl>
   </w:abstractNum>
-  <w:abstractNum w:abstractNumId="74" w15:restartNumberingAfterBreak="0">
+  <w:abstractNum w:abstractNumId="81" w15:restartNumberingAfterBreak="0">
+    <w:nsid w:val="59C9332B"/>
+    <w:multiLevelType w:val="multilevel"/>
+    <w:tmpl w:val="5FBAB906"/>
+    <w:lvl w:ilvl="0">
+      <w:start w:val="29"/>
+      <w:numFmt w:val="decimal"/>
+      <w:lvlText w:val="%1."/>
+      <w:lvlJc w:val="left"/>
+      <w:pPr>
+        <w:tabs>
+          <w:tab w:val="num" w:pos="720"/>
+        </w:tabs>
+        <w:ind w:left="720" w:hanging="360"/>
+      </w:pPr>
+    </w:lvl>
+    <w:lvl w:ilvl="1" w:tentative="1">
+      <w:start w:val="1"/>
+      <w:numFmt w:val="decimal"/>
+      <w:lvlText w:val="%2."/>
+      <w:lvlJc w:val="left"/>
+      <w:pPr>
+        <w:tabs>
+          <w:tab w:val="num" w:pos="1440"/>
+        </w:tabs>
+        <w:ind w:left="1440" w:hanging="360"/>
+      </w:pPr>
+    </w:lvl>
+    <w:lvl w:ilvl="2" w:tentative="1">
+      <w:start w:val="1"/>
+      <w:numFmt w:val="decimal"/>
+      <w:lvlText w:val="%3."/>
+      <w:lvlJc w:val="left"/>
+      <w:pPr>
+        <w:tabs>
+          <w:tab w:val="num" w:pos="2160"/>
+        </w:tabs>
+        <w:ind w:left="2160" w:hanging="360"/>
+      </w:pPr>
+    </w:lvl>
+    <w:lvl w:ilvl="3" w:tentative="1">
+      <w:start w:val="1"/>
+      <w:numFmt w:val="decimal"/>
+      <w:lvlText w:val="%4."/>
+      <w:lvlJc w:val="left"/>
+      <w:pPr>
+        <w:tabs>
+          <w:tab w:val="num" w:pos="2880"/>
+        </w:tabs>
+        <w:ind w:left="2880" w:hanging="360"/>
+      </w:pPr>
+    </w:lvl>
+    <w:lvl w:ilvl="4" w:tentative="1">
+      <w:start w:val="1"/>
+      <w:numFmt w:val="decimal"/>
+      <w:lvlText w:val="%5."/>
+      <w:lvlJc w:val="left"/>
+      <w:pPr>
+        <w:tabs>
+          <w:tab w:val="num" w:pos="3600"/>
+        </w:tabs>
+        <w:ind w:left="3600" w:hanging="360"/>
+      </w:pPr>
+    </w:lvl>
+    <w:lvl w:ilvl="5" w:tentative="1">
+      <w:start w:val="1"/>
+      <w:numFmt w:val="decimal"/>
+      <w:lvlText w:val="%6."/>
+      <w:lvlJc w:val="left"/>
+      <w:pPr>
+        <w:tabs>
+          <w:tab w:val="num" w:pos="4320"/>
+        </w:tabs>
+        <w:ind w:left="4320" w:hanging="360"/>
+      </w:pPr>
+    </w:lvl>
+    <w:lvl w:ilvl="6" w:tentative="1">
+      <w:start w:val="1"/>
+      <w:numFmt w:val="decimal"/>
+      <w:lvlText w:val="%7."/>
+      <w:lvlJc w:val="left"/>
+      <w:pPr>
+        <w:tabs>
+          <w:tab w:val="num" w:pos="5040"/>
+        </w:tabs>
+        <w:ind w:left="5040" w:hanging="360"/>
+      </w:pPr>
+    </w:lvl>
+    <w:lvl w:ilvl="7" w:tentative="1">
+      <w:start w:val="1"/>
+      <w:numFmt w:val="decimal"/>
+      <w:lvlText w:val="%8."/>
+      <w:lvlJc w:val="left"/>
+      <w:pPr>
+        <w:tabs>
+          <w:tab w:val="num" w:pos="5760"/>
+        </w:tabs>
+        <w:ind w:left="5760" w:hanging="360"/>
+      </w:pPr>
+    </w:lvl>
+    <w:lvl w:ilvl="8" w:tentative="1">
+      <w:start w:val="1"/>
+      <w:numFmt w:val="decimal"/>
+      <w:lvlText w:val="%9."/>
+      <w:lvlJc w:val="left"/>
+      <w:pPr>
+        <w:tabs>
+          <w:tab w:val="num" w:pos="6480"/>
+        </w:tabs>
+        <w:ind w:left="6480" w:hanging="360"/>
+      </w:pPr>
+    </w:lvl>
+  </w:abstractNum>
+  <w:abstractNum w:abstractNumId="82" w15:restartNumberingAfterBreak="0">
     <w:nsid w:val="5BD95A3C"/>
     <w:multiLevelType w:val="hybridMultilevel"/>
     <w:tmpl w:val="05FAA396"/>
@@ -8658,7 +11157,7 @@
       </w:rPr>
     </w:lvl>
   </w:abstractNum>
-  <w:abstractNum w:abstractNumId="75" w15:restartNumberingAfterBreak="0">
+  <w:abstractNum w:abstractNumId="83" w15:restartNumberingAfterBreak="0">
     <w:nsid w:val="5BE10937"/>
     <w:multiLevelType w:val="hybridMultilevel"/>
     <w:tmpl w:val="668EB6BC"/>
@@ -8771,7 +11270,7 @@
       </w:rPr>
     </w:lvl>
   </w:abstractNum>
-  <w:abstractNum w:abstractNumId="76" w15:restartNumberingAfterBreak="0">
+  <w:abstractNum w:abstractNumId="84" w15:restartNumberingAfterBreak="0">
     <w:nsid w:val="5BF045C0"/>
     <w:multiLevelType w:val="hybridMultilevel"/>
     <w:tmpl w:val="16F0615A"/>
@@ -8884,7 +11383,7 @@
       </w:rPr>
     </w:lvl>
   </w:abstractNum>
-  <w:abstractNum w:abstractNumId="77" w15:restartNumberingAfterBreak="0">
+  <w:abstractNum w:abstractNumId="85" w15:restartNumberingAfterBreak="0">
     <w:nsid w:val="5C6735F4"/>
     <w:multiLevelType w:val="hybridMultilevel"/>
     <w:tmpl w:val="3E9C533A"/>
@@ -8997,7 +11496,7 @@
       </w:rPr>
     </w:lvl>
   </w:abstractNum>
-  <w:abstractNum w:abstractNumId="78" w15:restartNumberingAfterBreak="0">
+  <w:abstractNum w:abstractNumId="86" w15:restartNumberingAfterBreak="0">
     <w:nsid w:val="5CB545CE"/>
     <w:multiLevelType w:val="hybridMultilevel"/>
     <w:tmpl w:val="496C468E"/>
@@ -9110,7 +11609,7 @@
       </w:rPr>
     </w:lvl>
   </w:abstractNum>
-  <w:abstractNum w:abstractNumId="79" w15:restartNumberingAfterBreak="0">
+  <w:abstractNum w:abstractNumId="87" w15:restartNumberingAfterBreak="0">
     <w:nsid w:val="5D012BC4"/>
     <w:multiLevelType w:val="hybridMultilevel"/>
     <w:tmpl w:val="551682B2"/>
@@ -9223,7 +11722,7 @@
       </w:rPr>
     </w:lvl>
   </w:abstractNum>
-  <w:abstractNum w:abstractNumId="80" w15:restartNumberingAfterBreak="0">
+  <w:abstractNum w:abstractNumId="88" w15:restartNumberingAfterBreak="0">
     <w:nsid w:val="60613915"/>
     <w:multiLevelType w:val="hybridMultilevel"/>
     <w:tmpl w:val="0EA2CBEC"/>
@@ -9336,7 +11835,7 @@
       </w:rPr>
     </w:lvl>
   </w:abstractNum>
-  <w:abstractNum w:abstractNumId="81" w15:restartNumberingAfterBreak="0">
+  <w:abstractNum w:abstractNumId="89" w15:restartNumberingAfterBreak="0">
     <w:nsid w:val="60F85140"/>
     <w:multiLevelType w:val="hybridMultilevel"/>
     <w:tmpl w:val="955EDC50"/>
@@ -9449,7 +11948,7 @@
       </w:rPr>
     </w:lvl>
   </w:abstractNum>
-  <w:abstractNum w:abstractNumId="82" w15:restartNumberingAfterBreak="0">
+  <w:abstractNum w:abstractNumId="90" w15:restartNumberingAfterBreak="0">
     <w:nsid w:val="619854DD"/>
     <w:multiLevelType w:val="hybridMultilevel"/>
     <w:tmpl w:val="EAA6A37E"/>
@@ -9562,7 +12061,7 @@
       </w:rPr>
     </w:lvl>
   </w:abstractNum>
-  <w:abstractNum w:abstractNumId="83" w15:restartNumberingAfterBreak="0">
+  <w:abstractNum w:abstractNumId="91" w15:restartNumberingAfterBreak="0">
     <w:nsid w:val="62756D5B"/>
     <w:multiLevelType w:val="hybridMultilevel"/>
     <w:tmpl w:val="F0B6F7F4"/>
@@ -9675,7 +12174,7 @@
       </w:rPr>
     </w:lvl>
   </w:abstractNum>
-  <w:abstractNum w:abstractNumId="84" w15:restartNumberingAfterBreak="0">
+  <w:abstractNum w:abstractNumId="92" w15:restartNumberingAfterBreak="0">
     <w:nsid w:val="629E1FE1"/>
     <w:multiLevelType w:val="hybridMultilevel"/>
     <w:tmpl w:val="71BEEE88"/>
@@ -9788,7 +12287,7 @@
       </w:rPr>
     </w:lvl>
   </w:abstractNum>
-  <w:abstractNum w:abstractNumId="85" w15:restartNumberingAfterBreak="0">
+  <w:abstractNum w:abstractNumId="93" w15:restartNumberingAfterBreak="0">
     <w:nsid w:val="62AA6AAC"/>
     <w:multiLevelType w:val="hybridMultilevel"/>
     <w:tmpl w:val="1994BC42"/>
@@ -9901,7 +12400,7 @@
       </w:rPr>
     </w:lvl>
   </w:abstractNum>
-  <w:abstractNum w:abstractNumId="86" w15:restartNumberingAfterBreak="0">
+  <w:abstractNum w:abstractNumId="94" w15:restartNumberingAfterBreak="0">
     <w:nsid w:val="63A171C7"/>
     <w:multiLevelType w:val="hybridMultilevel"/>
     <w:tmpl w:val="81EEE78C"/>
@@ -10014,7 +12513,7 @@
       </w:rPr>
     </w:lvl>
   </w:abstractNum>
-  <w:abstractNum w:abstractNumId="87" w15:restartNumberingAfterBreak="0">
+  <w:abstractNum w:abstractNumId="95" w15:restartNumberingAfterBreak="0">
     <w:nsid w:val="63E77221"/>
     <w:multiLevelType w:val="hybridMultilevel"/>
     <w:tmpl w:val="6AEC624C"/>
@@ -10127,7 +12626,7 @@
       </w:rPr>
     </w:lvl>
   </w:abstractNum>
-  <w:abstractNum w:abstractNumId="88" w15:restartNumberingAfterBreak="0">
+  <w:abstractNum w:abstractNumId="96" w15:restartNumberingAfterBreak="0">
     <w:nsid w:val="63FC1280"/>
     <w:multiLevelType w:val="hybridMultilevel"/>
     <w:tmpl w:val="C932210E"/>
@@ -10240,7 +12739,7 @@
       </w:rPr>
     </w:lvl>
   </w:abstractNum>
-  <w:abstractNum w:abstractNumId="89" w15:restartNumberingAfterBreak="0">
+  <w:abstractNum w:abstractNumId="97" w15:restartNumberingAfterBreak="0">
     <w:nsid w:val="64986612"/>
     <w:multiLevelType w:val="hybridMultilevel"/>
     <w:tmpl w:val="9E1044D0"/>
@@ -10329,7 +12828,7 @@
       </w:pPr>
     </w:lvl>
   </w:abstractNum>
-  <w:abstractNum w:abstractNumId="90" w15:restartNumberingAfterBreak="0">
+  <w:abstractNum w:abstractNumId="98" w15:restartNumberingAfterBreak="0">
     <w:nsid w:val="6593024E"/>
     <w:multiLevelType w:val="hybridMultilevel"/>
     <w:tmpl w:val="33DE2FD2"/>
@@ -10442,7 +12941,7 @@
       </w:rPr>
     </w:lvl>
   </w:abstractNum>
-  <w:abstractNum w:abstractNumId="91" w15:restartNumberingAfterBreak="0">
+  <w:abstractNum w:abstractNumId="99" w15:restartNumberingAfterBreak="0">
     <w:nsid w:val="66534159"/>
     <w:multiLevelType w:val="hybridMultilevel"/>
     <w:tmpl w:val="4E7A1300"/>
@@ -10555,7 +13054,7 @@
       </w:rPr>
     </w:lvl>
   </w:abstractNum>
-  <w:abstractNum w:abstractNumId="92" w15:restartNumberingAfterBreak="0">
+  <w:abstractNum w:abstractNumId="100" w15:restartNumberingAfterBreak="0">
     <w:nsid w:val="683866FB"/>
     <w:multiLevelType w:val="hybridMultilevel"/>
     <w:tmpl w:val="E8A0F628"/>
@@ -10668,7 +13167,7 @@
       </w:rPr>
     </w:lvl>
   </w:abstractNum>
-  <w:abstractNum w:abstractNumId="93" w15:restartNumberingAfterBreak="0">
+  <w:abstractNum w:abstractNumId="101" w15:restartNumberingAfterBreak="0">
     <w:nsid w:val="68CC2390"/>
     <w:multiLevelType w:val="hybridMultilevel"/>
     <w:tmpl w:val="17F46A68"/>
@@ -10781,7 +13280,7 @@
       </w:rPr>
     </w:lvl>
   </w:abstractNum>
-  <w:abstractNum w:abstractNumId="94" w15:restartNumberingAfterBreak="0">
+  <w:abstractNum w:abstractNumId="102" w15:restartNumberingAfterBreak="0">
     <w:nsid w:val="6A13308F"/>
     <w:multiLevelType w:val="hybridMultilevel"/>
     <w:tmpl w:val="46E0632E"/>
@@ -10894,7 +13393,7 @@
       </w:rPr>
     </w:lvl>
   </w:abstractNum>
-  <w:abstractNum w:abstractNumId="95" w15:restartNumberingAfterBreak="0">
+  <w:abstractNum w:abstractNumId="103" w15:restartNumberingAfterBreak="0">
     <w:nsid w:val="6A603B5F"/>
     <w:multiLevelType w:val="hybridMultilevel"/>
     <w:tmpl w:val="EA986414"/>
@@ -11007,7 +13506,7 @@
       </w:rPr>
     </w:lvl>
   </w:abstractNum>
-  <w:abstractNum w:abstractNumId="96" w15:restartNumberingAfterBreak="0">
+  <w:abstractNum w:abstractNumId="104" w15:restartNumberingAfterBreak="0">
     <w:nsid w:val="6D632CB6"/>
     <w:multiLevelType w:val="hybridMultilevel"/>
     <w:tmpl w:val="0354F17A"/>
@@ -11120,7 +13619,7 @@
       </w:rPr>
     </w:lvl>
   </w:abstractNum>
-  <w:abstractNum w:abstractNumId="97" w15:restartNumberingAfterBreak="0">
+  <w:abstractNum w:abstractNumId="105" w15:restartNumberingAfterBreak="0">
     <w:nsid w:val="6F69623F"/>
     <w:multiLevelType w:val="hybridMultilevel"/>
     <w:tmpl w:val="C89E0832"/>
@@ -11233,7 +13732,7 @@
       </w:rPr>
     </w:lvl>
   </w:abstractNum>
-  <w:abstractNum w:abstractNumId="98" w15:restartNumberingAfterBreak="0">
+  <w:abstractNum w:abstractNumId="106" w15:restartNumberingAfterBreak="0">
     <w:nsid w:val="70930F3B"/>
     <w:multiLevelType w:val="hybridMultilevel"/>
     <w:tmpl w:val="F0988DA4"/>
@@ -11346,7 +13845,7 @@
       </w:rPr>
     </w:lvl>
   </w:abstractNum>
-  <w:abstractNum w:abstractNumId="99" w15:restartNumberingAfterBreak="0">
+  <w:abstractNum w:abstractNumId="107" w15:restartNumberingAfterBreak="0">
     <w:nsid w:val="70C92BBB"/>
     <w:multiLevelType w:val="hybridMultilevel"/>
     <w:tmpl w:val="A790BF9A"/>
@@ -11459,7 +13958,7 @@
       </w:rPr>
     </w:lvl>
   </w:abstractNum>
-  <w:abstractNum w:abstractNumId="100" w15:restartNumberingAfterBreak="0">
+  <w:abstractNum w:abstractNumId="108" w15:restartNumberingAfterBreak="0">
     <w:nsid w:val="72365C7D"/>
     <w:multiLevelType w:val="hybridMultilevel"/>
     <w:tmpl w:val="3CD873DA"/>
@@ -11572,7 +14071,7 @@
       </w:rPr>
     </w:lvl>
   </w:abstractNum>
-  <w:abstractNum w:abstractNumId="101" w15:restartNumberingAfterBreak="0">
+  <w:abstractNum w:abstractNumId="109" w15:restartNumberingAfterBreak="0">
     <w:nsid w:val="72FC7B6E"/>
     <w:multiLevelType w:val="hybridMultilevel"/>
     <w:tmpl w:val="F30EEFCE"/>
@@ -11685,7 +14184,120 @@
       </w:rPr>
     </w:lvl>
   </w:abstractNum>
-  <w:abstractNum w:abstractNumId="102" w15:restartNumberingAfterBreak="0">
+  <w:abstractNum w:abstractNumId="110" w15:restartNumberingAfterBreak="0">
+    <w:nsid w:val="73206640"/>
+    <w:multiLevelType w:val="multilevel"/>
+    <w:tmpl w:val="E8B88846"/>
+    <w:lvl w:ilvl="0">
+      <w:start w:val="18"/>
+      <w:numFmt w:val="decimal"/>
+      <w:lvlText w:val="%1."/>
+      <w:lvlJc w:val="left"/>
+      <w:pPr>
+        <w:tabs>
+          <w:tab w:val="num" w:pos="720"/>
+        </w:tabs>
+        <w:ind w:left="720" w:hanging="360"/>
+      </w:pPr>
+    </w:lvl>
+    <w:lvl w:ilvl="1" w:tentative="1">
+      <w:start w:val="1"/>
+      <w:numFmt w:val="decimal"/>
+      <w:lvlText w:val="%2."/>
+      <w:lvlJc w:val="left"/>
+      <w:pPr>
+        <w:tabs>
+          <w:tab w:val="num" w:pos="1440"/>
+        </w:tabs>
+        <w:ind w:left="1440" w:hanging="360"/>
+      </w:pPr>
+    </w:lvl>
+    <w:lvl w:ilvl="2" w:tentative="1">
+      <w:start w:val="1"/>
+      <w:numFmt w:val="decimal"/>
+      <w:lvlText w:val="%3."/>
+      <w:lvlJc w:val="left"/>
+      <w:pPr>
+        <w:tabs>
+          <w:tab w:val="num" w:pos="2160"/>
+        </w:tabs>
+        <w:ind w:left="2160" w:hanging="360"/>
+      </w:pPr>
+    </w:lvl>
+    <w:lvl w:ilvl="3" w:tentative="1">
+      <w:start w:val="1"/>
+      <w:numFmt w:val="decimal"/>
+      <w:lvlText w:val="%4."/>
+      <w:lvlJc w:val="left"/>
+      <w:pPr>
+        <w:tabs>
+          <w:tab w:val="num" w:pos="2880"/>
+        </w:tabs>
+        <w:ind w:left="2880" w:hanging="360"/>
+      </w:pPr>
+    </w:lvl>
+    <w:lvl w:ilvl="4" w:tentative="1">
+      <w:start w:val="1"/>
+      <w:numFmt w:val="decimal"/>
+      <w:lvlText w:val="%5."/>
+      <w:lvlJc w:val="left"/>
+      <w:pPr>
+        <w:tabs>
+          <w:tab w:val="num" w:pos="3600"/>
+        </w:tabs>
+        <w:ind w:left="3600" w:hanging="360"/>
+      </w:pPr>
+    </w:lvl>
+    <w:lvl w:ilvl="5" w:tentative="1">
+      <w:start w:val="1"/>
+      <w:numFmt w:val="decimal"/>
+      <w:lvlText w:val="%6."/>
+      <w:lvlJc w:val="left"/>
+      <w:pPr>
+        <w:tabs>
+          <w:tab w:val="num" w:pos="4320"/>
+        </w:tabs>
+        <w:ind w:left="4320" w:hanging="360"/>
+      </w:pPr>
+    </w:lvl>
+    <w:lvl w:ilvl="6" w:tentative="1">
+      <w:start w:val="1"/>
+      <w:numFmt w:val="decimal"/>
+      <w:lvlText w:val="%7."/>
+      <w:lvlJc w:val="left"/>
+      <w:pPr>
+        <w:tabs>
+          <w:tab w:val="num" w:pos="5040"/>
+        </w:tabs>
+        <w:ind w:left="5040" w:hanging="360"/>
+      </w:pPr>
+    </w:lvl>
+    <w:lvl w:ilvl="7" w:tentative="1">
+      <w:start w:val="1"/>
+      <w:numFmt w:val="decimal"/>
+      <w:lvlText w:val="%8."/>
+      <w:lvlJc w:val="left"/>
+      <w:pPr>
+        <w:tabs>
+          <w:tab w:val="num" w:pos="5760"/>
+        </w:tabs>
+        <w:ind w:left="5760" w:hanging="360"/>
+      </w:pPr>
+    </w:lvl>
+    <w:lvl w:ilvl="8" w:tentative="1">
+      <w:start w:val="1"/>
+      <w:numFmt w:val="decimal"/>
+      <w:lvlText w:val="%9."/>
+      <w:lvlJc w:val="left"/>
+      <w:pPr>
+        <w:tabs>
+          <w:tab w:val="num" w:pos="6480"/>
+        </w:tabs>
+        <w:ind w:left="6480" w:hanging="360"/>
+      </w:pPr>
+    </w:lvl>
+  </w:abstractNum>
+  <w:abstractNum w:abstractNumId="111" w15:restartNumberingAfterBreak="0">
     <w:nsid w:val="7409519B"/>
     <w:multiLevelType w:val="hybridMultilevel"/>
     <w:tmpl w:val="D7F8E61C"/>
@@ -11798,7 +14410,7 @@
       </w:rPr>
     </w:lvl>
   </w:abstractNum>
-  <w:abstractNum w:abstractNumId="103" w15:restartNumberingAfterBreak="0">
+  <w:abstractNum w:abstractNumId="112" w15:restartNumberingAfterBreak="0">
     <w:nsid w:val="74D60887"/>
     <w:multiLevelType w:val="hybridMultilevel"/>
     <w:tmpl w:val="8ACC397A"/>
@@ -11911,7 +14523,120 @@
       </w:rPr>
     </w:lvl>
   </w:abstractNum>
-  <w:abstractNum w:abstractNumId="104" w15:restartNumberingAfterBreak="0">
+  <w:abstractNum w:abstractNumId="113" w15:restartNumberingAfterBreak="0">
+    <w:nsid w:val="7574262A"/>
+    <w:multiLevelType w:val="multilevel"/>
+    <w:tmpl w:val="9008E84A"/>
+    <w:lvl w:ilvl="0">
+      <w:start w:val="31"/>
+      <w:numFmt w:val="decimal"/>
+      <w:lvlText w:val="%1."/>
+      <w:lvlJc w:val="left"/>
+      <w:pPr>
+        <w:tabs>
+          <w:tab w:val="num" w:pos="720"/>
+        </w:tabs>
+        <w:ind w:left="720" w:hanging="360"/>
+      </w:pPr>
+    </w:lvl>
+    <w:lvl w:ilvl="1" w:tentative="1">
+      <w:start w:val="1"/>
+      <w:numFmt w:val="decimal"/>
+      <w:lvlText w:val="%2."/>
+      <w:lvlJc w:val="left"/>
+      <w:pPr>
+        <w:tabs>
+          <w:tab w:val="num" w:pos="1440"/>
+        </w:tabs>
+        <w:ind w:left="1440" w:hanging="360"/>
+      </w:pPr>
+    </w:lvl>
+    <w:lvl w:ilvl="2" w:tentative="1">
+      <w:start w:val="1"/>
+      <w:numFmt w:val="decimal"/>
+      <w:lvlText w:val="%3."/>
+      <w:lvlJc w:val="left"/>
+      <w:pPr>
+        <w:tabs>
+          <w:tab w:val="num" w:pos="2160"/>
+        </w:tabs>
+        <w:ind w:left="2160" w:hanging="360"/>
+      </w:pPr>
+    </w:lvl>
+    <w:lvl w:ilvl="3" w:tentative="1">
+      <w:start w:val="1"/>
+      <w:numFmt w:val="decimal"/>
+      <w:lvlText w:val="%4."/>
+      <w:lvlJc w:val="left"/>
+      <w:pPr>
+        <w:tabs>
+          <w:tab w:val="num" w:pos="2880"/>
+        </w:tabs>
+        <w:ind w:left="2880" w:hanging="360"/>
+      </w:pPr>
+    </w:lvl>
+    <w:lvl w:ilvl="4" w:tentative="1">
+      <w:start w:val="1"/>
+      <w:numFmt w:val="decimal"/>
+      <w:lvlText w:val="%5."/>
+      <w:lvlJc w:val="left"/>
+      <w:pPr>
+        <w:tabs>
+          <w:tab w:val="num" w:pos="3600"/>
+        </w:tabs>
+        <w:ind w:left="3600" w:hanging="360"/>
+      </w:pPr>
+    </w:lvl>
+    <w:lvl w:ilvl="5" w:tentative="1">
+      <w:start w:val="1"/>
+      <w:numFmt w:val="decimal"/>
+      <w:lvlText w:val="%6."/>
+      <w:lvlJc w:val="left"/>
+      <w:pPr>
+        <w:tabs>
+          <w:tab w:val="num" w:pos="4320"/>
+        </w:tabs>
+        <w:ind w:left="4320" w:hanging="360"/>
+      </w:pPr>
+    </w:lvl>
+    <w:lvl w:ilvl="6" w:tentative="1">
+      <w:start w:val="1"/>
+      <w:numFmt w:val="decimal"/>
+      <w:lvlText w:val="%7."/>
+      <w:lvlJc w:val="left"/>
+      <w:pPr>
+        <w:tabs>
+          <w:tab w:val="num" w:pos="5040"/>
+        </w:tabs>
+        <w:ind w:left="5040" w:hanging="360"/>
+      </w:pPr>
+    </w:lvl>
+    <w:lvl w:ilvl="7" w:tentative="1">
+      <w:start w:val="1"/>
+      <w:numFmt w:val="decimal"/>
+      <w:lvlText w:val="%8."/>
+      <w:lvlJc w:val="left"/>
+      <w:pPr>
+        <w:tabs>
+          <w:tab w:val="num" w:pos="5760"/>
+        </w:tabs>
+        <w:ind w:left="5760" w:hanging="360"/>
+      </w:pPr>
+    </w:lvl>
+    <w:lvl w:ilvl="8" w:tentative="1">
+      <w:start w:val="1"/>
+      <w:numFmt w:val="decimal"/>
+      <w:lvlText w:val="%9."/>
+      <w:lvlJc w:val="left"/>
+      <w:pPr>
+        <w:tabs>
+          <w:tab w:val="num" w:pos="6480"/>
+        </w:tabs>
+        <w:ind w:left="6480" w:hanging="360"/>
+      </w:pPr>
+    </w:lvl>
+  </w:abstractNum>
+  <w:abstractNum w:abstractNumId="114" w15:restartNumberingAfterBreak="0">
     <w:nsid w:val="766427A8"/>
     <w:multiLevelType w:val="hybridMultilevel"/>
     <w:tmpl w:val="303603A8"/>
@@ -12024,7 +14749,7 @@
       </w:rPr>
     </w:lvl>
   </w:abstractNum>
-  <w:abstractNum w:abstractNumId="105" w15:restartNumberingAfterBreak="0">
+  <w:abstractNum w:abstractNumId="115" w15:restartNumberingAfterBreak="0">
     <w:nsid w:val="76770158"/>
     <w:multiLevelType w:val="hybridMultilevel"/>
     <w:tmpl w:val="5C7ED9F6"/>
@@ -12137,7 +14862,7 @@
       </w:rPr>
     </w:lvl>
   </w:abstractNum>
-  <w:abstractNum w:abstractNumId="106" w15:restartNumberingAfterBreak="0">
+  <w:abstractNum w:abstractNumId="116" w15:restartNumberingAfterBreak="0">
     <w:nsid w:val="76EE51F1"/>
     <w:multiLevelType w:val="hybridMultilevel"/>
     <w:tmpl w:val="B0567EE6"/>
@@ -12250,7 +14975,7 @@
       </w:rPr>
     </w:lvl>
   </w:abstractNum>
-  <w:abstractNum w:abstractNumId="107" w15:restartNumberingAfterBreak="0">
+  <w:abstractNum w:abstractNumId="117" w15:restartNumberingAfterBreak="0">
     <w:nsid w:val="76F3285D"/>
     <w:multiLevelType w:val="hybridMultilevel"/>
     <w:tmpl w:val="76200902"/>
@@ -12363,7 +15088,7 @@
       </w:rPr>
     </w:lvl>
   </w:abstractNum>
-  <w:abstractNum w:abstractNumId="108" w15:restartNumberingAfterBreak="0">
+  <w:abstractNum w:abstractNumId="118" w15:restartNumberingAfterBreak="0">
     <w:nsid w:val="77BE0B33"/>
     <w:multiLevelType w:val="hybridMultilevel"/>
     <w:tmpl w:val="B4FA7786"/>
@@ -12476,7 +15201,7 @@
       </w:rPr>
     </w:lvl>
   </w:abstractNum>
-  <w:abstractNum w:abstractNumId="109" w15:restartNumberingAfterBreak="0">
+  <w:abstractNum w:abstractNumId="119" w15:restartNumberingAfterBreak="0">
     <w:nsid w:val="77FA135D"/>
     <w:multiLevelType w:val="hybridMultilevel"/>
     <w:tmpl w:val="F828D9D8"/>
@@ -12589,7 +15314,7 @@
       </w:rPr>
     </w:lvl>
   </w:abstractNum>
-  <w:abstractNum w:abstractNumId="110" w15:restartNumberingAfterBreak="0">
+  <w:abstractNum w:abstractNumId="120" w15:restartNumberingAfterBreak="0">
     <w:nsid w:val="78E94A57"/>
     <w:multiLevelType w:val="hybridMultilevel"/>
     <w:tmpl w:val="6DDADD54"/>
@@ -12702,7 +15427,7 @@
       </w:rPr>
     </w:lvl>
   </w:abstractNum>
-  <w:abstractNum w:abstractNumId="111" w15:restartNumberingAfterBreak="0">
+  <w:abstractNum w:abstractNumId="121" w15:restartNumberingAfterBreak="0">
     <w:nsid w:val="7AB12DFB"/>
     <w:multiLevelType w:val="hybridMultilevel"/>
     <w:tmpl w:val="65A2688C"/>
@@ -12815,7 +15540,7 @@
       </w:rPr>
     </w:lvl>
   </w:abstractNum>
-  <w:abstractNum w:abstractNumId="112" w15:restartNumberingAfterBreak="0">
+  <w:abstractNum w:abstractNumId="122" w15:restartNumberingAfterBreak="0">
     <w:nsid w:val="7ADF20F4"/>
     <w:multiLevelType w:val="hybridMultilevel"/>
     <w:tmpl w:val="C6B801CC"/>
@@ -12928,7 +15653,7 @@
       </w:rPr>
     </w:lvl>
   </w:abstractNum>
-  <w:abstractNum w:abstractNumId="113" w15:restartNumberingAfterBreak="0">
+  <w:abstractNum w:abstractNumId="123" w15:restartNumberingAfterBreak="0">
     <w:nsid w:val="7C6D39D7"/>
     <w:multiLevelType w:val="hybridMultilevel"/>
     <w:tmpl w:val="4E4A030E"/>
@@ -13041,7 +15766,7 @@
       </w:rPr>
     </w:lvl>
   </w:abstractNum>
-  <w:abstractNum w:abstractNumId="114" w15:restartNumberingAfterBreak="0">
+  <w:abstractNum w:abstractNumId="124" w15:restartNumberingAfterBreak="0">
     <w:nsid w:val="7C954217"/>
     <w:multiLevelType w:val="hybridMultilevel"/>
     <w:tmpl w:val="3C3417B2"/>
@@ -13154,7 +15879,7 @@
       </w:rPr>
     </w:lvl>
   </w:abstractNum>
-  <w:abstractNum w:abstractNumId="115" w15:restartNumberingAfterBreak="0">
+  <w:abstractNum w:abstractNumId="125" w15:restartNumberingAfterBreak="0">
     <w:nsid w:val="7C994488"/>
     <w:multiLevelType w:val="hybridMultilevel"/>
     <w:tmpl w:val="A7725FC2"/>
@@ -13267,7 +15992,7 @@
       </w:rPr>
     </w:lvl>
   </w:abstractNum>
-  <w:abstractNum w:abstractNumId="116" w15:restartNumberingAfterBreak="0">
+  <w:abstractNum w:abstractNumId="126" w15:restartNumberingAfterBreak="0">
     <w:nsid w:val="7D2701BD"/>
     <w:multiLevelType w:val="hybridMultilevel"/>
     <w:tmpl w:val="9710B1AA"/>
@@ -13381,355 +16106,385 @@
     </w:lvl>
   </w:abstractNum>
   <w:num w:numId="1" w16cid:durableId="1213467834">
+    <w:abstractNumId w:val="106"/>
+  </w:num>
+  <w:num w:numId="2" w16cid:durableId="1360738597">
+    <w:abstractNumId w:val="120"/>
+  </w:num>
+  <w:num w:numId="3" w16cid:durableId="75829065">
+    <w:abstractNumId w:val="41"/>
+  </w:num>
+  <w:num w:numId="4" w16cid:durableId="2130203712">
+    <w:abstractNumId w:val="87"/>
+  </w:num>
+  <w:num w:numId="5" w16cid:durableId="138421626">
+    <w:abstractNumId w:val="96"/>
+  </w:num>
+  <w:num w:numId="6" w16cid:durableId="867182000">
+    <w:abstractNumId w:val="26"/>
+  </w:num>
+  <w:num w:numId="7" w16cid:durableId="1120801382">
+    <w:abstractNumId w:val="7"/>
+  </w:num>
+  <w:num w:numId="8" w16cid:durableId="879324960">
+    <w:abstractNumId w:val="104"/>
+  </w:num>
+  <w:num w:numId="9" w16cid:durableId="386688103">
+    <w:abstractNumId w:val="34"/>
+  </w:num>
+  <w:num w:numId="10" w16cid:durableId="539443273">
+    <w:abstractNumId w:val="118"/>
+  </w:num>
+  <w:num w:numId="11" w16cid:durableId="1799251721">
+    <w:abstractNumId w:val="11"/>
+  </w:num>
+  <w:num w:numId="12" w16cid:durableId="1036465103">
+    <w:abstractNumId w:val="51"/>
+  </w:num>
+  <w:num w:numId="13" w16cid:durableId="60451172">
+    <w:abstractNumId w:val="103"/>
+  </w:num>
+  <w:num w:numId="14" w16cid:durableId="935940176">
+    <w:abstractNumId w:val="71"/>
+  </w:num>
+  <w:num w:numId="15" w16cid:durableId="813915632">
+    <w:abstractNumId w:val="30"/>
+  </w:num>
+  <w:num w:numId="16" w16cid:durableId="755134343">
+    <w:abstractNumId w:val="93"/>
+  </w:num>
+  <w:num w:numId="17" w16cid:durableId="2115710341">
+    <w:abstractNumId w:val="9"/>
+  </w:num>
+  <w:num w:numId="18" w16cid:durableId="1706638671">
+    <w:abstractNumId w:val="64"/>
+  </w:num>
+  <w:num w:numId="19" w16cid:durableId="1576210515">
+    <w:abstractNumId w:val="99"/>
+  </w:num>
+  <w:num w:numId="20" w16cid:durableId="1048796122">
+    <w:abstractNumId w:val="8"/>
+  </w:num>
+  <w:num w:numId="21" w16cid:durableId="1220364659">
+    <w:abstractNumId w:val="116"/>
+  </w:num>
+  <w:num w:numId="22" w16cid:durableId="924338947">
+    <w:abstractNumId w:val="114"/>
+  </w:num>
+  <w:num w:numId="23" w16cid:durableId="428476592">
+    <w:abstractNumId w:val="13"/>
+  </w:num>
+  <w:num w:numId="24" w16cid:durableId="1178691032">
+    <w:abstractNumId w:val="94"/>
+  </w:num>
+  <w:num w:numId="25" w16cid:durableId="1737317753">
+    <w:abstractNumId w:val="39"/>
+  </w:num>
+  <w:num w:numId="26" w16cid:durableId="964772593">
+    <w:abstractNumId w:val="92"/>
+  </w:num>
+  <w:num w:numId="27" w16cid:durableId="892152731">
+    <w:abstractNumId w:val="12"/>
+  </w:num>
+  <w:num w:numId="28" w16cid:durableId="1162696697">
+    <w:abstractNumId w:val="38"/>
+  </w:num>
+  <w:num w:numId="29" w16cid:durableId="497966918">
+    <w:abstractNumId w:val="86"/>
+  </w:num>
+  <w:num w:numId="30" w16cid:durableId="466237943">
+    <w:abstractNumId w:val="105"/>
+  </w:num>
+  <w:num w:numId="31" w16cid:durableId="1974671777">
+    <w:abstractNumId w:val="95"/>
+  </w:num>
+  <w:num w:numId="32" w16cid:durableId="1229999412">
+    <w:abstractNumId w:val="24"/>
+  </w:num>
+  <w:num w:numId="33" w16cid:durableId="1501626374">
+    <w:abstractNumId w:val="32"/>
+  </w:num>
+  <w:num w:numId="34" w16cid:durableId="1292395099">
+    <w:abstractNumId w:val="16"/>
+  </w:num>
+  <w:num w:numId="35" w16cid:durableId="619069715">
+    <w:abstractNumId w:val="57"/>
+  </w:num>
+  <w:num w:numId="36" w16cid:durableId="1683437176">
+    <w:abstractNumId w:val="76"/>
+  </w:num>
+  <w:num w:numId="37" w16cid:durableId="1684628704">
+    <w:abstractNumId w:val="47"/>
+  </w:num>
+  <w:num w:numId="38" w16cid:durableId="758986333">
+    <w:abstractNumId w:val="67"/>
+  </w:num>
+  <w:num w:numId="39" w16cid:durableId="843857266">
+    <w:abstractNumId w:val="2"/>
+  </w:num>
+  <w:num w:numId="40" w16cid:durableId="963121662">
+    <w:abstractNumId w:val="112"/>
+  </w:num>
+  <w:num w:numId="41" w16cid:durableId="1136021905">
+    <w:abstractNumId w:val="123"/>
+  </w:num>
+  <w:num w:numId="42" w16cid:durableId="1202132054">
+    <w:abstractNumId w:val="91"/>
+  </w:num>
+  <w:num w:numId="43" w16cid:durableId="1408383857">
+    <w:abstractNumId w:val="29"/>
+  </w:num>
+  <w:num w:numId="44" w16cid:durableId="1841192221">
+    <w:abstractNumId w:val="121"/>
+  </w:num>
+  <w:num w:numId="45" w16cid:durableId="874199779">
+    <w:abstractNumId w:val="75"/>
+  </w:num>
+  <w:num w:numId="46" w16cid:durableId="224415520">
+    <w:abstractNumId w:val="56"/>
+  </w:num>
+  <w:num w:numId="47" w16cid:durableId="1670795378">
+    <w:abstractNumId w:val="83"/>
+  </w:num>
+  <w:num w:numId="48" w16cid:durableId="1659116451">
+    <w:abstractNumId w:val="89"/>
+  </w:num>
+  <w:num w:numId="49" w16cid:durableId="904531309">
+    <w:abstractNumId w:val="73"/>
+  </w:num>
+  <w:num w:numId="50" w16cid:durableId="332494078">
+    <w:abstractNumId w:val="5"/>
+  </w:num>
+  <w:num w:numId="51" w16cid:durableId="1415081431">
+    <w:abstractNumId w:val="49"/>
+  </w:num>
+  <w:num w:numId="52" w16cid:durableId="1407193320">
+    <w:abstractNumId w:val="61"/>
+  </w:num>
+  <w:num w:numId="53" w16cid:durableId="1185511898">
+    <w:abstractNumId w:val="119"/>
+  </w:num>
+  <w:num w:numId="54" w16cid:durableId="1866675799">
+    <w:abstractNumId w:val="108"/>
+  </w:num>
+  <w:num w:numId="55" w16cid:durableId="1571304272">
+    <w:abstractNumId w:val="70"/>
+  </w:num>
+  <w:num w:numId="56" w16cid:durableId="79106569">
+    <w:abstractNumId w:val="20"/>
+  </w:num>
+  <w:num w:numId="57" w16cid:durableId="1316762829">
+    <w:abstractNumId w:val="66"/>
+  </w:num>
+  <w:num w:numId="58" w16cid:durableId="1807315057">
+    <w:abstractNumId w:val="88"/>
+  </w:num>
+  <w:num w:numId="59" w16cid:durableId="542402363">
+    <w:abstractNumId w:val="19"/>
+  </w:num>
+  <w:num w:numId="60" w16cid:durableId="1825773232">
+    <w:abstractNumId w:val="37"/>
+  </w:num>
+  <w:num w:numId="61" w16cid:durableId="2103380322">
+    <w:abstractNumId w:val="46"/>
+  </w:num>
+  <w:num w:numId="62" w16cid:durableId="729574461">
+    <w:abstractNumId w:val="43"/>
+  </w:num>
+  <w:num w:numId="63" w16cid:durableId="541862098">
+    <w:abstractNumId w:val="62"/>
+  </w:num>
+  <w:num w:numId="64" w16cid:durableId="795220650">
+    <w:abstractNumId w:val="33"/>
+  </w:num>
+  <w:num w:numId="65" w16cid:durableId="1985308093">
+    <w:abstractNumId w:val="90"/>
+  </w:num>
+  <w:num w:numId="66" w16cid:durableId="718944814">
+    <w:abstractNumId w:val="53"/>
+  </w:num>
+  <w:num w:numId="67" w16cid:durableId="718431785">
+    <w:abstractNumId w:val="126"/>
+  </w:num>
+  <w:num w:numId="68" w16cid:durableId="1363165161">
+    <w:abstractNumId w:val="28"/>
+  </w:num>
+  <w:num w:numId="69" w16cid:durableId="730079366">
+    <w:abstractNumId w:val="109"/>
+  </w:num>
+  <w:num w:numId="70" w16cid:durableId="1202010423">
+    <w:abstractNumId w:val="50"/>
+  </w:num>
+  <w:num w:numId="71" w16cid:durableId="1013608338">
+    <w:abstractNumId w:val="3"/>
+  </w:num>
+  <w:num w:numId="72" w16cid:durableId="2124839484">
+    <w:abstractNumId w:val="22"/>
+  </w:num>
+  <w:num w:numId="73" w16cid:durableId="1917401928">
+    <w:abstractNumId w:val="14"/>
+  </w:num>
+  <w:num w:numId="74" w16cid:durableId="534462150">
+    <w:abstractNumId w:val="100"/>
+  </w:num>
+  <w:num w:numId="75" w16cid:durableId="687370390">
+    <w:abstractNumId w:val="107"/>
+  </w:num>
+  <w:num w:numId="76" w16cid:durableId="867646908">
+    <w:abstractNumId w:val="17"/>
+  </w:num>
+  <w:num w:numId="77" w16cid:durableId="971598080">
+    <w:abstractNumId w:val="1"/>
+  </w:num>
+  <w:num w:numId="78" w16cid:durableId="830869039">
+    <w:abstractNumId w:val="58"/>
+  </w:num>
+  <w:num w:numId="79" w16cid:durableId="268318009">
+    <w:abstractNumId w:val="31"/>
+  </w:num>
+  <w:num w:numId="80" w16cid:durableId="1452092556">
+    <w:abstractNumId w:val="54"/>
+  </w:num>
+  <w:num w:numId="81" w16cid:durableId="708261496">
+    <w:abstractNumId w:val="78"/>
+  </w:num>
+  <w:num w:numId="82" w16cid:durableId="2132477818">
+    <w:abstractNumId w:val="4"/>
+  </w:num>
+  <w:num w:numId="83" w16cid:durableId="1932153384">
+    <w:abstractNumId w:val="18"/>
+  </w:num>
+  <w:num w:numId="84" w16cid:durableId="1833325868">
+    <w:abstractNumId w:val="55"/>
+  </w:num>
+  <w:num w:numId="85" w16cid:durableId="1494763391">
+    <w:abstractNumId w:val="35"/>
+  </w:num>
+  <w:num w:numId="86" w16cid:durableId="1847402676">
+    <w:abstractNumId w:val="77"/>
+  </w:num>
+  <w:num w:numId="87" w16cid:durableId="859469643">
+    <w:abstractNumId w:val="72"/>
+  </w:num>
+  <w:num w:numId="88" w16cid:durableId="474373370">
+    <w:abstractNumId w:val="44"/>
+  </w:num>
+  <w:num w:numId="89" w16cid:durableId="1568953248">
+    <w:abstractNumId w:val="101"/>
+  </w:num>
+  <w:num w:numId="90" w16cid:durableId="150604144">
+    <w:abstractNumId w:val="59"/>
+  </w:num>
+  <w:num w:numId="91" w16cid:durableId="974601620">
+    <w:abstractNumId w:val="15"/>
+  </w:num>
+  <w:num w:numId="92" w16cid:durableId="682897172">
+    <w:abstractNumId w:val="60"/>
+  </w:num>
+  <w:num w:numId="93" w16cid:durableId="969821879">
+    <w:abstractNumId w:val="115"/>
+  </w:num>
+  <w:num w:numId="94" w16cid:durableId="378747787">
+    <w:abstractNumId w:val="111"/>
+  </w:num>
+  <w:num w:numId="95" w16cid:durableId="367074375">
+    <w:abstractNumId w:val="97"/>
+  </w:num>
+  <w:num w:numId="96" w16cid:durableId="1730416052">
+    <w:abstractNumId w:val="85"/>
+  </w:num>
+  <w:num w:numId="97" w16cid:durableId="1882788647">
+    <w:abstractNumId w:val="124"/>
+  </w:num>
+  <w:num w:numId="98" w16cid:durableId="735397442">
+    <w:abstractNumId w:val="27"/>
+  </w:num>
+  <w:num w:numId="99" w16cid:durableId="1371805749">
+    <w:abstractNumId w:val="82"/>
+  </w:num>
+  <w:num w:numId="100" w16cid:durableId="297298108">
+    <w:abstractNumId w:val="48"/>
+  </w:num>
+  <w:num w:numId="101" w16cid:durableId="2038657647">
+    <w:abstractNumId w:val="102"/>
+  </w:num>
+  <w:num w:numId="102" w16cid:durableId="258147469">
+    <w:abstractNumId w:val="63"/>
+  </w:num>
+  <w:num w:numId="103" w16cid:durableId="1012226404">
+    <w:abstractNumId w:val="42"/>
+  </w:num>
+  <w:num w:numId="104" w16cid:durableId="707294205">
+    <w:abstractNumId w:val="6"/>
+  </w:num>
+  <w:num w:numId="105" w16cid:durableId="271130938">
+    <w:abstractNumId w:val="79"/>
+  </w:num>
+  <w:num w:numId="106" w16cid:durableId="31617081">
+    <w:abstractNumId w:val="122"/>
+  </w:num>
+  <w:num w:numId="107" w16cid:durableId="196164206">
+    <w:abstractNumId w:val="84"/>
+  </w:num>
+  <w:num w:numId="108" w16cid:durableId="1561818118">
     <w:abstractNumId w:val="98"/>
   </w:num>
-  <w:num w:numId="2" w16cid:durableId="1360738597">
+  <w:num w:numId="109" w16cid:durableId="1774085804">
+    <w:abstractNumId w:val="45"/>
+  </w:num>
+  <w:num w:numId="110" w16cid:durableId="378361761">
+    <w:abstractNumId w:val="117"/>
+  </w:num>
+  <w:num w:numId="111" w16cid:durableId="1608079829">
+    <w:abstractNumId w:val="10"/>
+  </w:num>
+  <w:num w:numId="112" w16cid:durableId="1949778429">
+    <w:abstractNumId w:val="69"/>
+  </w:num>
+  <w:num w:numId="113" w16cid:durableId="2023387564">
+    <w:abstractNumId w:val="36"/>
+  </w:num>
+  <w:num w:numId="114" w16cid:durableId="1216773504">
+    <w:abstractNumId w:val="80"/>
+  </w:num>
+  <w:num w:numId="115" w16cid:durableId="1422411238">
+    <w:abstractNumId w:val="65"/>
+  </w:num>
+  <w:num w:numId="116" w16cid:durableId="981663762">
+    <w:abstractNumId w:val="74"/>
+  </w:num>
+  <w:num w:numId="117" w16cid:durableId="1620993290">
+    <w:abstractNumId w:val="125"/>
+  </w:num>
+  <w:num w:numId="118" w16cid:durableId="2118789459">
+    <w:abstractNumId w:val="52"/>
+  </w:num>
+  <w:num w:numId="119" w16cid:durableId="1825659009">
+    <w:abstractNumId w:val="21"/>
+  </w:num>
+  <w:num w:numId="120" w16cid:durableId="1540777674">
+    <w:abstractNumId w:val="25"/>
+  </w:num>
+  <w:num w:numId="121" w16cid:durableId="326326863">
+    <w:abstractNumId w:val="40"/>
+  </w:num>
+  <w:num w:numId="122" w16cid:durableId="1853638963">
+    <w:abstractNumId w:val="68"/>
+  </w:num>
+  <w:num w:numId="123" w16cid:durableId="609968201">
     <w:abstractNumId w:val="110"/>
   </w:num>
-  <w:num w:numId="3" w16cid:durableId="75829065">
-    <w:abstractNumId w:val="36"/>
+  <w:num w:numId="124" w16cid:durableId="1183936304">
+    <w:abstractNumId w:val="23"/>
   </w:num>
-  <w:num w:numId="4" w16cid:durableId="2130203712">
-    <w:abstractNumId w:val="79"/>
-  </w:num>
-  <w:num w:numId="5" w16cid:durableId="138421626">
-    <w:abstractNumId w:val="88"/>
-  </w:num>
-  <w:num w:numId="6" w16cid:durableId="867182000">
-    <w:abstractNumId w:val="22"/>
-  </w:num>
-  <w:num w:numId="7" w16cid:durableId="1120801382">
-    <w:abstractNumId w:val="6"/>
-  </w:num>
-  <w:num w:numId="8" w16cid:durableId="879324960">
-    <w:abstractNumId w:val="96"/>
-  </w:num>
-  <w:num w:numId="9" w16cid:durableId="386688103">
-    <w:abstractNumId w:val="30"/>
-  </w:num>
-  <w:num w:numId="10" w16cid:durableId="539443273">
-    <w:abstractNumId w:val="108"/>
-  </w:num>
-  <w:num w:numId="11" w16cid:durableId="1799251721">
-    <w:abstractNumId w:val="10"/>
-  </w:num>
-  <w:num w:numId="12" w16cid:durableId="1036465103">
-    <w:abstractNumId w:val="46"/>
-  </w:num>
-  <w:num w:numId="13" w16cid:durableId="60451172">
-    <w:abstractNumId w:val="95"/>
-  </w:num>
-  <w:num w:numId="14" w16cid:durableId="935940176">
-    <w:abstractNumId w:val="64"/>
-  </w:num>
-  <w:num w:numId="15" w16cid:durableId="813915632">
-    <w:abstractNumId w:val="26"/>
-  </w:num>
-  <w:num w:numId="16" w16cid:durableId="755134343">
-    <w:abstractNumId w:val="85"/>
-  </w:num>
-  <w:num w:numId="17" w16cid:durableId="2115710341">
-    <w:abstractNumId w:val="8"/>
-  </w:num>
-  <w:num w:numId="18" w16cid:durableId="1706638671">
-    <w:abstractNumId w:val="58"/>
-  </w:num>
-  <w:num w:numId="19" w16cid:durableId="1576210515">
-    <w:abstractNumId w:val="91"/>
-  </w:num>
-  <w:num w:numId="20" w16cid:durableId="1048796122">
-    <w:abstractNumId w:val="7"/>
-  </w:num>
-  <w:num w:numId="21" w16cid:durableId="1220364659">
-    <w:abstractNumId w:val="106"/>
-  </w:num>
-  <w:num w:numId="22" w16cid:durableId="924338947">
-    <w:abstractNumId w:val="104"/>
-  </w:num>
-  <w:num w:numId="23" w16cid:durableId="428476592">
-    <w:abstractNumId w:val="12"/>
-  </w:num>
-  <w:num w:numId="24" w16cid:durableId="1178691032">
-    <w:abstractNumId w:val="86"/>
-  </w:num>
-  <w:num w:numId="25" w16cid:durableId="1737317753">
-    <w:abstractNumId w:val="35"/>
-  </w:num>
-  <w:num w:numId="26" w16cid:durableId="964772593">
-    <w:abstractNumId w:val="84"/>
-  </w:num>
-  <w:num w:numId="27" w16cid:durableId="892152731">
-    <w:abstractNumId w:val="11"/>
-  </w:num>
-  <w:num w:numId="28" w16cid:durableId="1162696697">
-    <w:abstractNumId w:val="34"/>
-  </w:num>
-  <w:num w:numId="29" w16cid:durableId="497966918">
-    <w:abstractNumId w:val="78"/>
-  </w:num>
-  <w:num w:numId="30" w16cid:durableId="466237943">
-    <w:abstractNumId w:val="97"/>
-  </w:num>
-  <w:num w:numId="31" w16cid:durableId="1974671777">
-    <w:abstractNumId w:val="87"/>
-  </w:num>
-  <w:num w:numId="32" w16cid:durableId="1229999412">
-    <w:abstractNumId w:val="21"/>
-  </w:num>
-  <w:num w:numId="33" w16cid:durableId="1501626374">
-    <w:abstractNumId w:val="28"/>
-  </w:num>
-  <w:num w:numId="34" w16cid:durableId="1292395099">
-    <w:abstractNumId w:val="15"/>
-  </w:num>
-  <w:num w:numId="35" w16cid:durableId="619069715">
-    <w:abstractNumId w:val="51"/>
-  </w:num>
-  <w:num w:numId="36" w16cid:durableId="1683437176">
-    <w:abstractNumId w:val="69"/>
-  </w:num>
-  <w:num w:numId="37" w16cid:durableId="1684628704">
-    <w:abstractNumId w:val="42"/>
-  </w:num>
-  <w:num w:numId="38" w16cid:durableId="758986333">
-    <w:abstractNumId w:val="61"/>
-  </w:num>
-  <w:num w:numId="39" w16cid:durableId="843857266">
-    <w:abstractNumId w:val="1"/>
-  </w:num>
-  <w:num w:numId="40" w16cid:durableId="963121662">
-    <w:abstractNumId w:val="103"/>
-  </w:num>
-  <w:num w:numId="41" w16cid:durableId="1136021905">
-    <w:abstractNumId w:val="113"/>
-  </w:num>
-  <w:num w:numId="42" w16cid:durableId="1202132054">
-    <w:abstractNumId w:val="83"/>
-  </w:num>
-  <w:num w:numId="43" w16cid:durableId="1408383857">
-    <w:abstractNumId w:val="25"/>
-  </w:num>
-  <w:num w:numId="44" w16cid:durableId="1841192221">
-    <w:abstractNumId w:val="111"/>
-  </w:num>
-  <w:num w:numId="45" w16cid:durableId="874199779">
-    <w:abstractNumId w:val="68"/>
-  </w:num>
-  <w:num w:numId="46" w16cid:durableId="224415520">
-    <w:abstractNumId w:val="50"/>
-  </w:num>
-  <w:num w:numId="47" w16cid:durableId="1670795378">
-    <w:abstractNumId w:val="75"/>
-  </w:num>
-  <w:num w:numId="48" w16cid:durableId="1659116451">
+  <w:num w:numId="125" w16cid:durableId="1326517148">
     <w:abstractNumId w:val="81"/>
   </w:num>
-  <w:num w:numId="49" w16cid:durableId="904531309">
-    <w:abstractNumId w:val="66"/>
-  </w:num>
-  <w:num w:numId="50" w16cid:durableId="332494078">
-    <w:abstractNumId w:val="4"/>
-  </w:num>
-  <w:num w:numId="51" w16cid:durableId="1415081431">
-    <w:abstractNumId w:val="44"/>
-  </w:num>
-  <w:num w:numId="52" w16cid:durableId="1407193320">
-    <w:abstractNumId w:val="55"/>
-  </w:num>
-  <w:num w:numId="53" w16cid:durableId="1185511898">
-    <w:abstractNumId w:val="109"/>
-  </w:num>
-  <w:num w:numId="54" w16cid:durableId="1866675799">
-    <w:abstractNumId w:val="100"/>
-  </w:num>
-  <w:num w:numId="55" w16cid:durableId="1571304272">
-    <w:abstractNumId w:val="63"/>
-  </w:num>
-  <w:num w:numId="56" w16cid:durableId="79106569">
-    <w:abstractNumId w:val="19"/>
-  </w:num>
-  <w:num w:numId="57" w16cid:durableId="1316762829">
-    <w:abstractNumId w:val="60"/>
-  </w:num>
-  <w:num w:numId="58" w16cid:durableId="1807315057">
-    <w:abstractNumId w:val="80"/>
-  </w:num>
-  <w:num w:numId="59" w16cid:durableId="542402363">
-    <w:abstractNumId w:val="18"/>
-  </w:num>
-  <w:num w:numId="60" w16cid:durableId="1825773232">
-    <w:abstractNumId w:val="33"/>
-  </w:num>
-  <w:num w:numId="61" w16cid:durableId="2103380322">
-    <w:abstractNumId w:val="41"/>
-  </w:num>
-  <w:num w:numId="62" w16cid:durableId="729574461">
-    <w:abstractNumId w:val="38"/>
-  </w:num>
-  <w:num w:numId="63" w16cid:durableId="541862098">
-    <w:abstractNumId w:val="56"/>
-  </w:num>
-  <w:num w:numId="64" w16cid:durableId="795220650">
-    <w:abstractNumId w:val="29"/>
-  </w:num>
-  <w:num w:numId="65" w16cid:durableId="1985308093">
-    <w:abstractNumId w:val="82"/>
-  </w:num>
-  <w:num w:numId="66" w16cid:durableId="718944814">
-    <w:abstractNumId w:val="47"/>
-  </w:num>
-  <w:num w:numId="67" w16cid:durableId="718431785">
-    <w:abstractNumId w:val="116"/>
-  </w:num>
-  <w:num w:numId="68" w16cid:durableId="1363165161">
-    <w:abstractNumId w:val="24"/>
-  </w:num>
-  <w:num w:numId="69" w16cid:durableId="730079366">
-    <w:abstractNumId w:val="101"/>
-  </w:num>
-  <w:num w:numId="70" w16cid:durableId="1202010423">
-    <w:abstractNumId w:val="45"/>
-  </w:num>
-  <w:num w:numId="71" w16cid:durableId="1013608338">
-    <w:abstractNumId w:val="2"/>
-  </w:num>
-  <w:num w:numId="72" w16cid:durableId="2124839484">
-    <w:abstractNumId w:val="20"/>
-  </w:num>
-  <w:num w:numId="73" w16cid:durableId="1917401928">
-    <w:abstractNumId w:val="13"/>
-  </w:num>
-  <w:num w:numId="74" w16cid:durableId="534462150">
-    <w:abstractNumId w:val="92"/>
-  </w:num>
-  <w:num w:numId="75" w16cid:durableId="687370390">
-    <w:abstractNumId w:val="99"/>
-  </w:num>
-  <w:num w:numId="76" w16cid:durableId="867646908">
-    <w:abstractNumId w:val="16"/>
-  </w:num>
-  <w:num w:numId="77" w16cid:durableId="971598080">
+  <w:num w:numId="126" w16cid:durableId="1780635840">
     <w:abstractNumId w:val="0"/>
   </w:num>
-  <w:num w:numId="78" w16cid:durableId="830869039">
-    <w:abstractNumId w:val="52"/>
-  </w:num>
-  <w:num w:numId="79" w16cid:durableId="268318009">
-    <w:abstractNumId w:val="27"/>
-  </w:num>
-  <w:num w:numId="80" w16cid:durableId="1452092556">
-    <w:abstractNumId w:val="48"/>
-  </w:num>
-  <w:num w:numId="81" w16cid:durableId="708261496">
-    <w:abstractNumId w:val="71"/>
-  </w:num>
-  <w:num w:numId="82" w16cid:durableId="2132477818">
-    <w:abstractNumId w:val="3"/>
-  </w:num>
-  <w:num w:numId="83" w16cid:durableId="1932153384">
-    <w:abstractNumId w:val="17"/>
-  </w:num>
-  <w:num w:numId="84" w16cid:durableId="1833325868">
-    <w:abstractNumId w:val="49"/>
-  </w:num>
-  <w:num w:numId="85" w16cid:durableId="1494763391">
-    <w:abstractNumId w:val="31"/>
-  </w:num>
-  <w:num w:numId="86" w16cid:durableId="1847402676">
-    <w:abstractNumId w:val="70"/>
-  </w:num>
-  <w:num w:numId="87" w16cid:durableId="859469643">
-    <w:abstractNumId w:val="65"/>
-  </w:num>
-  <w:num w:numId="88" w16cid:durableId="474373370">
-    <w:abstractNumId w:val="39"/>
-  </w:num>
-  <w:num w:numId="89" w16cid:durableId="1568953248">
-    <w:abstractNumId w:val="93"/>
-  </w:num>
-  <w:num w:numId="90" w16cid:durableId="150604144">
-    <w:abstractNumId w:val="53"/>
-  </w:num>
-  <w:num w:numId="91" w16cid:durableId="974601620">
-    <w:abstractNumId w:val="14"/>
-  </w:num>
-  <w:num w:numId="92" w16cid:durableId="682897172">
-    <w:abstractNumId w:val="54"/>
-  </w:num>
-  <w:num w:numId="93" w16cid:durableId="969821879">
-    <w:abstractNumId w:val="105"/>
-  </w:num>
-  <w:num w:numId="94" w16cid:durableId="378747787">
-    <w:abstractNumId w:val="102"/>
-  </w:num>
-  <w:num w:numId="95" w16cid:durableId="367074375">
-    <w:abstractNumId w:val="89"/>
-  </w:num>
-  <w:num w:numId="96" w16cid:durableId="1730416052">
-    <w:abstractNumId w:val="77"/>
-  </w:num>
-  <w:num w:numId="97" w16cid:durableId="1882788647">
-    <w:abstractNumId w:val="114"/>
-  </w:num>
-  <w:num w:numId="98" w16cid:durableId="735397442">
-    <w:abstractNumId w:val="23"/>
-  </w:num>
-  <w:num w:numId="99" w16cid:durableId="1371805749">
-    <w:abstractNumId w:val="74"/>
-  </w:num>
-  <w:num w:numId="100" w16cid:durableId="297298108">
-    <w:abstractNumId w:val="43"/>
-  </w:num>
-  <w:num w:numId="101" w16cid:durableId="2038657647">
-    <w:abstractNumId w:val="94"/>
-  </w:num>
-  <w:num w:numId="102" w16cid:durableId="258147469">
-    <w:abstractNumId w:val="57"/>
-  </w:num>
-  <w:num w:numId="103" w16cid:durableId="1012226404">
-    <w:abstractNumId w:val="37"/>
-  </w:num>
-  <w:num w:numId="104" w16cid:durableId="707294205">
-    <w:abstractNumId w:val="5"/>
-  </w:num>
-  <w:num w:numId="105" w16cid:durableId="271130938">
-    <w:abstractNumId w:val="72"/>
-  </w:num>
-  <w:num w:numId="106" w16cid:durableId="31617081">
-    <w:abstractNumId w:val="112"/>
-  </w:num>
-  <w:num w:numId="107" w16cid:durableId="196164206">
-    <w:abstractNumId w:val="76"/>
-  </w:num>
-  <w:num w:numId="108" w16cid:durableId="1561818118">
-    <w:abstractNumId w:val="90"/>
-  </w:num>
-  <w:num w:numId="109" w16cid:durableId="1774085804">
-    <w:abstractNumId w:val="40"/>
-  </w:num>
-  <w:num w:numId="110" w16cid:durableId="378361761">
-    <w:abstractNumId w:val="107"/>
-  </w:num>
-  <w:num w:numId="111" w16cid:durableId="1608079829">
-    <w:abstractNumId w:val="9"/>
-  </w:num>
-  <w:num w:numId="112" w16cid:durableId="1949778429">
-    <w:abstractNumId w:val="62"/>
-  </w:num>
-  <w:num w:numId="113" w16cid:durableId="2023387564">
-    <w:abstractNumId w:val="32"/>
-  </w:num>
-  <w:num w:numId="114" w16cid:durableId="1216773504">
-    <w:abstractNumId w:val="73"/>
-  </w:num>
-  <w:num w:numId="115" w16cid:durableId="1422411238">
-    <w:abstractNumId w:val="59"/>
-  </w:num>
-  <w:num w:numId="116" w16cid:durableId="981663762">
-    <w:abstractNumId w:val="67"/>
-  </w:num>
-  <w:num w:numId="117" w16cid:durableId="1620993290">
-    <w:abstractNumId w:val="115"/>
+  <w:num w:numId="127" w16cid:durableId="5061575">
+    <w:abstractNumId w:val="113"/>
   </w:num>
 </w:numbering>
 </file>

</xml_diff>